<commit_message>
docs: sync store publish plan and progress report for any machine
Keep Railway URLs, AAB/IPA checklist, listing assets, and client progress report in git so publish steps stay consistent across devices (binaries stay local/gitignore).

Co-authored-by: Cursor <cursoragent@cursor.com>
</commit_message>
<xml_diff>
--- a/docs/client/BaoCao_TienDo_PhatHanh_DienChan.docx
+++ b/docs/client/BaoCao_TienDo_PhatHanh_DienChan.docx
@@ -48,7 +48,7 @@
           <w:sz w:val="19"/>
           <w:szCs w:val="19"/>
         </w:rPr>
-        <w:t xml:space="preserve">Ứng dụng DienChan trên App Store và Google Play  ·  Ngày 15/10/2026  ·  Người lập: Lê Hoàng Anh</w:t>
+        <w:t xml:space="preserve">Ứng dụng DienChan trên App Store và Google Play  ·  Cập nhật ngày 16/10/2026  ·  Người lập: Lê Hoàng Anh</w:t>
       </w:r>
     </w:p>
     <w:p>
@@ -84,7 +84,7 @@
           <w:sz w:val="21"/>
           <w:szCs w:val="21"/>
         </w:rPr>
-        <w:t xml:space="preserve">Báo cáo này tổng hợp tiến độ hiện tại, các bước để đưa ứng dụng lên App Store (iPhone) và Google Play (Android), thông tin Thầy cần cung cấp và lịch dự kiến.</w:t>
+        <w:t xml:space="preserve">Báo cáo cập nhật tiến độ đến ngày 16/10/2026: máy chủ thật và email đã chạy, các chức năng chính đã dùng được trên môi trường production; phần còn lại tập trung hoàn thiện và đăng store.</w:t>
       </w:r>
     </w:p>
     <w:p>
@@ -138,7 +138,7 @@
                 <w:sz w:val="22"/>
                 <w:szCs w:val="22"/>
               </w:rPr>
-              <w:t xml:space="preserve">Tóm tắt</w:t>
+              <w:t xml:space="preserve">Tóm tắt đến 16/10/2026</w:t>
             </w:r>
           </w:p>
           <w:p>
@@ -153,7 +153,7 @@
                 <w:sz w:val="21"/>
                 <w:szCs w:val="21"/>
               </w:rPr>
-              <w:t xml:space="preserve">Tiến độ: </w:t>
+              <w:t xml:space="preserve">Đã xong: </w:t>
             </w:r>
             <w:r>
               <w:rPr>
@@ -161,7 +161,7 @@
                 <w:sz w:val="21"/>
                 <w:szCs w:val="21"/>
               </w:rPr>
-              <w:t xml:space="preserve">phần lớn chức năng đã hoàn thành và bản iPhone đã build thành công. Còn 3 hạng mục đang hoàn thiện; thư viện phác đồ tiếp tục được bổ sung.</w:t>
+              <w:t xml:space="preserve">máy chủ Railway + Postgres, gửi email Resend, đăng ký/đăng nhập/quên mật khẩu, hồ sơ, chat, thông báo, tra huyệt 2D/3D (nút Số/Lưới), trang pháp lý, thương hiệu DienChan.</w:t>
             </w:r>
           </w:p>
           <w:p>
@@ -176,7 +176,7 @@
                 <w:sz w:val="21"/>
                 <w:szCs w:val="21"/>
               </w:rPr>
-              <w:t xml:space="preserve">Việc cần Thầy: </w:t>
+              <w:t xml:space="preserve">Đang làm: </w:t>
             </w:r>
             <w:r>
               <w:rPr>
@@ -184,26 +184,7 @@
                 <w:sz w:val="21"/>
                 <w:szCs w:val="21"/>
               </w:rPr>
-              <w:t xml:space="preserve">cung cấp email và thông tin ở mục 3 </w:t>
-            </w:r>
-            <w:r>
-              <w:rPr>
-                <w:rFonts w:ascii="Arial" w:cs="Arial" w:eastAsia="Arial" w:hAnsi="Arial"/>
-                <w:b/>
-                <w:bCs/>
-                <w:color w:val="B55238"/>
-                <w:sz w:val="21"/>
-                <w:szCs w:val="21"/>
-              </w:rPr>
-              <w:t xml:space="preserve">trước ngày 20/10/2026</w:t>
-            </w:r>
-            <w:r>
-              <w:rPr>
-                <w:rFonts w:ascii="Arial" w:cs="Arial" w:eastAsia="Arial" w:hAnsi="Arial"/>
-                <w:sz w:val="21"/>
-                <w:szCs w:val="21"/>
-              </w:rPr>
-              <w:t xml:space="preserve"> để đăng ký tài khoản đứng tên chủ sở hữu.</w:t>
+              <w:t xml:space="preserve">đối chiếu thêm tọa độ huyệt theo sơ đồ, tìm kiếm giọng nói, nhắc giờ trên điện thoại, CMS quản trị nội dung.</w:t>
             </w:r>
           </w:p>
           <w:p>
@@ -218,7 +199,7 @@
                 <w:sz w:val="21"/>
                 <w:szCs w:val="21"/>
               </w:rPr>
-              <w:t xml:space="preserve">Dự kiến lên store: </w:t>
+              <w:t xml:space="preserve">Việc cần Thầy: </w:t>
             </w:r>
             <w:r>
               <w:rPr>
@@ -226,7 +207,48 @@
                 <w:sz w:val="21"/>
                 <w:szCs w:val="21"/>
               </w:rPr>
-              <w:t xml:space="preserve">iPhone khoảng 09–11/11/2026; Android khoảng 12–17/11/2026 (Google bắt buộc 14 ngày thử nghiệm kín).</w:t>
+              <w:t xml:space="preserve">thông tin mục 3 và đăng ký </w:t>
+            </w:r>
+            <w:r>
+              <w:rPr>
+                <w:rFonts w:ascii="Arial" w:cs="Arial" w:eastAsia="Arial" w:hAnsi="Arial"/>
+                <w:b/>
+                <w:bCs/>
+                <w:sz w:val="21"/>
+                <w:szCs w:val="21"/>
+              </w:rPr>
+              <w:t xml:space="preserve">Apple Developer + Google Play Console</w:t>
+            </w:r>
+            <w:r>
+              <w:rPr>
+                <w:rFonts w:ascii="Arial" w:cs="Arial" w:eastAsia="Arial" w:hAnsi="Arial"/>
+                <w:sz w:val="21"/>
+                <w:szCs w:val="21"/>
+              </w:rPr>
+              <w:t xml:space="preserve"> đứng tên chủ sở hữu để nộp store.</w:t>
+            </w:r>
+          </w:p>
+          <w:p>
+            <w:pPr>
+              <w:spacing w:after="60" w:line="290"/>
+            </w:pPr>
+            <w:r>
+              <w:rPr>
+                <w:rFonts w:ascii="Arial" w:cs="Arial" w:eastAsia="Arial" w:hAnsi="Arial"/>
+                <w:b/>
+                <w:bCs/>
+                <w:sz w:val="21"/>
+                <w:szCs w:val="21"/>
+              </w:rPr>
+              <w:t xml:space="preserve">Dự kiến lên store: </w:t>
+            </w:r>
+            <w:r>
+              <w:rPr>
+                <w:rFonts w:ascii="Arial" w:cs="Arial" w:eastAsia="Arial" w:hAnsi="Arial"/>
+                <w:sz w:val="21"/>
+                <w:szCs w:val="21"/>
+              </w:rPr>
+              <w:t xml:space="preserve">iPhone khoảng 07–12/11/2026; Android khoảng 11–18/11/2026 (nếu tài khoản Google cá nhân: thêm 14 ngày thử nghiệm kín).</w:t>
             </w:r>
           </w:p>
         </w:tc>
@@ -425,7 +447,7 @@
                 <w:sz w:val="19"/>
                 <w:szCs w:val="19"/>
               </w:rPr>
-              <w:t xml:space="preserve">Tra cứu huyệt</w:t>
+              <w:t xml:space="preserve">Tra cứu huyệt 2D/3D</w:t>
             </w:r>
           </w:p>
         </w:tc>
@@ -458,7 +480,7 @@
                 <w:sz w:val="19"/>
                 <w:szCs w:val="19"/>
               </w:rPr>
-              <w:t xml:space="preserve">Mặt 3D xoay được, đồ hình chính diện/trắc diện; chụp khuôn mặt và phủ điểm huyệt lên ảnh (ảnh xử lý trên máy, không tải lên).</w:t>
+              <w:t xml:space="preserve">Chuyển 2D–3D, nút bật/tắt số huyệt và lưới; đồ hình chính diện/trắc diện theo lưới BQC; chụp mặt phủ huyệt trên máy.</w:t>
             </w:r>
           </w:p>
         </w:tc>
@@ -672,7 +694,7 @@
                 <w:sz w:val="19"/>
                 <w:szCs w:val="19"/>
               </w:rPr>
-              <w:t xml:space="preserve">8 bộ phác đồ theo sách, từng bước liên kết tới vị trí huyệt trên đồ hình; tiếp tục bổ sung thêm phác đồ cho đa dạng.</w:t>
+              <w:t xml:space="preserve">8 bộ phác đồ theo sách, từng bước liên kết tới vị trí huyệt; tiếp tục bổ sung thêm cho đa dạng.</w:t>
             </w:r>
           </w:p>
         </w:tc>
@@ -779,7 +801,7 @@
                 <w:sz w:val="19"/>
                 <w:szCs w:val="19"/>
               </w:rPr>
-              <w:t xml:space="preserve">Đăng ký/đăng nhập bằng email, quên mật khẩu qua email, đăng nhập Apple, xóa tài khoản.</w:t>
+              <w:t xml:space="preserve">Đăng ký/đăng nhập email, quên mật khẩu gửi mã thật qua Resend, đăng nhập Apple, xóa tài khoản; email chưa đăng ký được báo rõ.</w:t>
             </w:r>
           </w:p>
         </w:tc>
@@ -886,7 +908,7 @@
                 <w:sz w:val="19"/>
                 <w:szCs w:val="19"/>
               </w:rPr>
-              <w:t xml:space="preserve">Hồ sơ, ảnh đại diện, nhật ký day huyệt, mục yêu thích, phác đồ cá nhân; đồng bộ theo tài khoản trên máy chủ.</w:t>
+              <w:t xml:space="preserve">Hồ sơ, ảnh đại diện, nhật ký, mục yêu thích, phác đồ cá nhân; đồng bộ theo tài khoản trên máy chủ Railway.</w:t>
             </w:r>
           </w:p>
         </w:tc>
@@ -1100,7 +1122,7 @@
                 <w:sz w:val="19"/>
                 <w:szCs w:val="19"/>
               </w:rPr>
-              <w:t xml:space="preserve">Đăng ký khóa học, gửi yêu cầu hỗ trợ, thông báo trong ứng dụng; quản trị nhận email khi có đăng ký mới.</w:t>
+              <w:t xml:space="preserve">Đăng ký khóa học, gửi yêu cầu hỗ trợ, thông báo trong ứng dụng; quản trị nhận email.</w:t>
             </w:r>
           </w:p>
         </w:tc>
@@ -1174,7 +1196,7 @@
                 <w:sz w:val="19"/>
                 <w:szCs w:val="19"/>
               </w:rPr>
-              <w:t xml:space="preserve">Yêu cầu bắt buộc của store</w:t>
+              <w:t xml:space="preserve">Máy chủ production</w:t>
             </w:r>
           </w:p>
         </w:tc>
@@ -1207,7 +1229,7 @@
                 <w:sz w:val="19"/>
                 <w:szCs w:val="19"/>
               </w:rPr>
-              <w:t xml:space="preserve">Cảnh báo sức khỏe, Chính sách quyền riêng tư, Điều khoản, trang Hỗ trợ, trang Xóa tài khoản.</w:t>
+              <w:t xml:space="preserve">Railway + Postgres đã chạy; domain freelancedienchanapp-production.up.railway.app; health ok, mail ok.</w:t>
             </w:r>
           </w:p>
         </w:tc>
@@ -1281,7 +1303,7 @@
                 <w:sz w:val="19"/>
                 <w:szCs w:val="19"/>
               </w:rPr>
-              <w:t xml:space="preserve">Nhận diện thương hiệu</w:t>
+              <w:t xml:space="preserve">Email (Resend)</w:t>
             </w:r>
           </w:p>
         </w:tc>
@@ -1314,7 +1336,7 @@
                 <w:sz w:val="19"/>
                 <w:szCs w:val="19"/>
               </w:rPr>
-              <w:t xml:space="preserve">Logo, tên hiển thị DienChan, mã ứng dụng com.dienchan.app; bản iPhone đã build thành công.</w:t>
+              <w:t xml:space="preserve">Đã cấu hình gửi mail quên mật khẩu; đang dùng domain thử Resend (gửi ổn định sau khi gắn tên miền riêng).</w:t>
             </w:r>
           </w:p>
         </w:tc>
@@ -1388,7 +1410,7 @@
                 <w:sz w:val="19"/>
                 <w:szCs w:val="19"/>
               </w:rPr>
-              <w:t xml:space="preserve">Tìm kiếm bằng giọng nói</w:t>
+              <w:t xml:space="preserve">Yêu cầu bắt buộc của store</w:t>
             </w:r>
           </w:p>
         </w:tc>
@@ -1421,7 +1443,7 @@
                 <w:sz w:val="19"/>
                 <w:szCs w:val="19"/>
               </w:rPr>
-              <w:t xml:space="preserve">Đã có giao diện; đang tích hợp nhận diện giọng nói tiếng Việt.</w:t>
+              <w:t xml:space="preserve">Cảnh báo sức khỏe, /privacy, /terms, /support, /delete-account; nội dung đăng store đã soạn.</w:t>
             </w:r>
           </w:p>
         </w:tc>
@@ -1434,7 +1456,7 @@
               <w:bottom w:val="single" w:color="D5E0D9" w:sz="4"/>
               <w:right w:val="single" w:color="D5E0D9" w:sz="4"/>
             </w:tcBorders>
-            <w:shd w:fill="FFF1DC" w:color="auto" w:val="clear"/>
+            <w:shd w:fill="E3F2E8" w:color="auto" w:val="clear"/>
             <w:tcMar>
               <w:top w:type="dxa" w:w="70"/>
               <w:left w:type="dxa" w:w="100"/>
@@ -1453,11 +1475,11 @@
                 <w:rFonts w:ascii="Arial" w:cs="Arial" w:eastAsia="Arial" w:hAnsi="Arial"/>
                 <w:b/>
                 <w:bCs/>
-                <w:color w:val="9A5B00"/>
-                <w:sz w:val="19"/>
-                <w:szCs w:val="19"/>
-              </w:rPr>
-              <w:t xml:space="preserve">Đang hoàn thiện</w:t>
+                <w:color w:val="1E4F38"/>
+                <w:sz w:val="19"/>
+                <w:szCs w:val="19"/>
+              </w:rPr>
+              <w:t xml:space="preserve">Hoàn thành</w:t>
             </w:r>
           </w:p>
         </w:tc>
@@ -1495,7 +1517,7 @@
                 <w:sz w:val="19"/>
                 <w:szCs w:val="19"/>
               </w:rPr>
-              <w:t xml:space="preserve">Nhắc giờ day huyệt</w:t>
+              <w:t xml:space="preserve">Nhận diện thương hiệu</w:t>
             </w:r>
           </w:p>
         </w:tc>
@@ -1528,7 +1550,7 @@
                 <w:sz w:val="19"/>
                 <w:szCs w:val="19"/>
               </w:rPr>
-              <w:t xml:space="preserve">Đã lưu lịch nhắc theo tài khoản; đang bổ sung thông báo trên điện thoại khi đến giờ.</w:t>
+              <w:t xml:space="preserve">Logo Diện Chẩn, tên DienChan, mã com.dienchan.app; bản iPhone đã build; icon ghim web đã cập nhật.</w:t>
             </w:r>
           </w:p>
         </w:tc>
@@ -1541,7 +1563,7 @@
               <w:bottom w:val="single" w:color="D5E0D9" w:sz="4"/>
               <w:right w:val="single" w:color="D5E0D9" w:sz="4"/>
             </w:tcBorders>
-            <w:shd w:fill="FFF1DC" w:color="auto" w:val="clear"/>
+            <w:shd w:fill="E3F2E8" w:color="auto" w:val="clear"/>
             <w:tcMar>
               <w:top w:type="dxa" w:w="70"/>
               <w:left w:type="dxa" w:w="100"/>
@@ -1560,11 +1582,11 @@
                 <w:rFonts w:ascii="Arial" w:cs="Arial" w:eastAsia="Arial" w:hAnsi="Arial"/>
                 <w:b/>
                 <w:bCs/>
-                <w:color w:val="9A5B00"/>
-                <w:sz w:val="19"/>
-                <w:szCs w:val="19"/>
-              </w:rPr>
-              <w:t xml:space="preserve">Đang hoàn thiện</w:t>
+                <w:color w:val="1E4F38"/>
+                <w:sz w:val="19"/>
+                <w:szCs w:val="19"/>
+              </w:rPr>
+              <w:t xml:space="preserve">Hoàn thành</w:t>
             </w:r>
           </w:p>
         </w:tc>
@@ -1602,7 +1624,7 @@
                 <w:sz w:val="19"/>
                 <w:szCs w:val="19"/>
               </w:rPr>
-              <w:t xml:space="preserve">Quản trị nội dung (CMS)</w:t>
+              <w:t xml:space="preserve">Tọa độ huyệt chi tiết</w:t>
             </w:r>
           </w:p>
         </w:tc>
@@ -1635,7 +1657,7 @@
                 <w:sz w:val="19"/>
                 <w:szCs w:val="19"/>
               </w:rPr>
-              <w:t xml:space="preserve">Hiện nội dung do đội phát triển cập nhật; đang xây công cụ để quản trị viên tự nhập/sửa.</w:t>
+              <w:t xml:space="preserve">Đã số hóa ~198 điểm chính diện và ~98 điểm trắc diện; tiếp tục đối chiếu từng điểm theo sơ đồ Thầy gửi.</w:t>
             </w:r>
           </w:p>
         </w:tc>
@@ -1709,7 +1731,7 @@
                 <w:sz w:val="19"/>
                 <w:szCs w:val="19"/>
               </w:rPr>
-              <w:t xml:space="preserve">Máy chủ &amp; bản phát hành</w:t>
+              <w:t xml:space="preserve">Tìm kiếm bằng giọng nói</w:t>
             </w:r>
           </w:p>
         </w:tc>
@@ -1742,7 +1764,328 @@
                 <w:sz w:val="19"/>
                 <w:szCs w:val="19"/>
               </w:rPr>
-              <w:t xml:space="preserve">Đã sẵn sàng cấu hình; cần tài khoản ở mục 3 để triển khai máy chủ thật và build bản Android.</w:t>
+              <w:t xml:space="preserve">Đã có giao diện; đang tích hợp nhận diện giọng nói tiếng Việt.</w:t>
+            </w:r>
+          </w:p>
+        </w:tc>
+        <w:tc>
+          <w:tcPr>
+            <w:tcW w:type="dxa" w:w="1800"/>
+            <w:tcBorders>
+              <w:top w:val="single" w:color="D5E0D9" w:sz="4"/>
+              <w:left w:val="single" w:color="D5E0D9" w:sz="4"/>
+              <w:bottom w:val="single" w:color="D5E0D9" w:sz="4"/>
+              <w:right w:val="single" w:color="D5E0D9" w:sz="4"/>
+            </w:tcBorders>
+            <w:shd w:fill="FFF1DC" w:color="auto" w:val="clear"/>
+            <w:tcMar>
+              <w:top w:type="dxa" w:w="70"/>
+              <w:left w:type="dxa" w:w="100"/>
+              <w:bottom w:type="dxa" w:w="70"/>
+              <w:right w:type="dxa" w:w="100"/>
+            </w:tcMar>
+            <w:vAlign w:val="center"/>
+          </w:tcPr>
+          <w:p>
+            <w:pPr>
+              <w:spacing w:after="20" w:line="270"/>
+              <w:jc w:val="center"/>
+            </w:pPr>
+            <w:r>
+              <w:rPr>
+                <w:rFonts w:ascii="Arial" w:cs="Arial" w:eastAsia="Arial" w:hAnsi="Arial"/>
+                <w:b/>
+                <w:bCs/>
+                <w:color w:val="9A5B00"/>
+                <w:sz w:val="19"/>
+                <w:szCs w:val="19"/>
+              </w:rPr>
+              <w:t xml:space="preserve">Đang hoàn thiện</w:t>
+            </w:r>
+          </w:p>
+        </w:tc>
+      </w:tr>
+      <w:tr>
+        <w:trPr>
+          <w:cantSplit/>
+        </w:trPr>
+        <w:tc>
+          <w:tcPr>
+            <w:tcW w:type="dxa" w:w="2300"/>
+            <w:tcBorders>
+              <w:top w:val="single" w:color="D5E0D9" w:sz="4"/>
+              <w:left w:val="single" w:color="D5E0D9" w:sz="4"/>
+              <w:bottom w:val="single" w:color="D5E0D9" w:sz="4"/>
+              <w:right w:val="single" w:color="D5E0D9" w:sz="4"/>
+            </w:tcBorders>
+            <w:tcMar>
+              <w:top w:type="dxa" w:w="70"/>
+              <w:left w:type="dxa" w:w="100"/>
+              <w:bottom w:type="dxa" w:w="70"/>
+              <w:right w:type="dxa" w:w="100"/>
+            </w:tcMar>
+            <w:vAlign w:val="center"/>
+          </w:tcPr>
+          <w:p>
+            <w:pPr>
+              <w:spacing w:after="20" w:line="270"/>
+            </w:pPr>
+            <w:r>
+              <w:rPr>
+                <w:rFonts w:ascii="Arial" w:cs="Arial" w:eastAsia="Arial" w:hAnsi="Arial"/>
+                <w:b/>
+                <w:bCs/>
+                <w:sz w:val="19"/>
+                <w:szCs w:val="19"/>
+              </w:rPr>
+              <w:t xml:space="preserve">Nhắc giờ day huyệt</w:t>
+            </w:r>
+          </w:p>
+        </w:tc>
+        <w:tc>
+          <w:tcPr>
+            <w:tcW w:type="dxa" w:w="5538"/>
+            <w:tcBorders>
+              <w:top w:val="single" w:color="D5E0D9" w:sz="4"/>
+              <w:left w:val="single" w:color="D5E0D9" w:sz="4"/>
+              <w:bottom w:val="single" w:color="D5E0D9" w:sz="4"/>
+              <w:right w:val="single" w:color="D5E0D9" w:sz="4"/>
+            </w:tcBorders>
+            <w:tcMar>
+              <w:top w:type="dxa" w:w="70"/>
+              <w:left w:type="dxa" w:w="100"/>
+              <w:bottom w:type="dxa" w:w="70"/>
+              <w:right w:type="dxa" w:w="100"/>
+            </w:tcMar>
+            <w:vAlign w:val="center"/>
+          </w:tcPr>
+          <w:p>
+            <w:pPr>
+              <w:spacing w:after="20" w:line="270"/>
+            </w:pPr>
+            <w:r>
+              <w:rPr>
+                <w:rFonts w:ascii="Arial" w:cs="Arial" w:eastAsia="Arial" w:hAnsi="Arial"/>
+                <w:b w:val="false"/>
+                <w:bCs w:val="false"/>
+                <w:sz w:val="19"/>
+                <w:szCs w:val="19"/>
+              </w:rPr>
+              <w:t xml:space="preserve">Đã lưu lịch nhắc theo tài khoản; đang bổ sung thông báo trên điện thoại khi đến giờ.</w:t>
+            </w:r>
+          </w:p>
+        </w:tc>
+        <w:tc>
+          <w:tcPr>
+            <w:tcW w:type="dxa" w:w="1800"/>
+            <w:tcBorders>
+              <w:top w:val="single" w:color="D5E0D9" w:sz="4"/>
+              <w:left w:val="single" w:color="D5E0D9" w:sz="4"/>
+              <w:bottom w:val="single" w:color="D5E0D9" w:sz="4"/>
+              <w:right w:val="single" w:color="D5E0D9" w:sz="4"/>
+            </w:tcBorders>
+            <w:shd w:fill="FFF1DC" w:color="auto" w:val="clear"/>
+            <w:tcMar>
+              <w:top w:type="dxa" w:w="70"/>
+              <w:left w:type="dxa" w:w="100"/>
+              <w:bottom w:type="dxa" w:w="70"/>
+              <w:right w:type="dxa" w:w="100"/>
+            </w:tcMar>
+            <w:vAlign w:val="center"/>
+          </w:tcPr>
+          <w:p>
+            <w:pPr>
+              <w:spacing w:after="20" w:line="270"/>
+              <w:jc w:val="center"/>
+            </w:pPr>
+            <w:r>
+              <w:rPr>
+                <w:rFonts w:ascii="Arial" w:cs="Arial" w:eastAsia="Arial" w:hAnsi="Arial"/>
+                <w:b/>
+                <w:bCs/>
+                <w:color w:val="9A5B00"/>
+                <w:sz w:val="19"/>
+                <w:szCs w:val="19"/>
+              </w:rPr>
+              <w:t xml:space="preserve">Đang hoàn thiện</w:t>
+            </w:r>
+          </w:p>
+        </w:tc>
+      </w:tr>
+      <w:tr>
+        <w:trPr>
+          <w:cantSplit/>
+        </w:trPr>
+        <w:tc>
+          <w:tcPr>
+            <w:tcW w:type="dxa" w:w="2300"/>
+            <w:tcBorders>
+              <w:top w:val="single" w:color="D5E0D9" w:sz="4"/>
+              <w:left w:val="single" w:color="D5E0D9" w:sz="4"/>
+              <w:bottom w:val="single" w:color="D5E0D9" w:sz="4"/>
+              <w:right w:val="single" w:color="D5E0D9" w:sz="4"/>
+            </w:tcBorders>
+            <w:tcMar>
+              <w:top w:type="dxa" w:w="70"/>
+              <w:left w:type="dxa" w:w="100"/>
+              <w:bottom w:type="dxa" w:w="70"/>
+              <w:right w:type="dxa" w:w="100"/>
+            </w:tcMar>
+            <w:vAlign w:val="center"/>
+          </w:tcPr>
+          <w:p>
+            <w:pPr>
+              <w:spacing w:after="20" w:line="270"/>
+            </w:pPr>
+            <w:r>
+              <w:rPr>
+                <w:rFonts w:ascii="Arial" w:cs="Arial" w:eastAsia="Arial" w:hAnsi="Arial"/>
+                <w:b/>
+                <w:bCs/>
+                <w:sz w:val="19"/>
+                <w:szCs w:val="19"/>
+              </w:rPr>
+              <w:t xml:space="preserve">Quản trị nội dung (CMS)</w:t>
+            </w:r>
+          </w:p>
+        </w:tc>
+        <w:tc>
+          <w:tcPr>
+            <w:tcW w:type="dxa" w:w="5538"/>
+            <w:tcBorders>
+              <w:top w:val="single" w:color="D5E0D9" w:sz="4"/>
+              <w:left w:val="single" w:color="D5E0D9" w:sz="4"/>
+              <w:bottom w:val="single" w:color="D5E0D9" w:sz="4"/>
+              <w:right w:val="single" w:color="D5E0D9" w:sz="4"/>
+            </w:tcBorders>
+            <w:tcMar>
+              <w:top w:type="dxa" w:w="70"/>
+              <w:left w:type="dxa" w:w="100"/>
+              <w:bottom w:type="dxa" w:w="70"/>
+              <w:right w:type="dxa" w:w="100"/>
+            </w:tcMar>
+            <w:vAlign w:val="center"/>
+          </w:tcPr>
+          <w:p>
+            <w:pPr>
+              <w:spacing w:after="20" w:line="270"/>
+            </w:pPr>
+            <w:r>
+              <w:rPr>
+                <w:rFonts w:ascii="Arial" w:cs="Arial" w:eastAsia="Arial" w:hAnsi="Arial"/>
+                <w:b w:val="false"/>
+                <w:bCs w:val="false"/>
+                <w:sz w:val="19"/>
+                <w:szCs w:val="19"/>
+              </w:rPr>
+              <w:t xml:space="preserve">Hiện nội dung do đội phát triển cập nhật; đang xây công cụ để quản trị viên tự nhập/sửa.</w:t>
+            </w:r>
+          </w:p>
+        </w:tc>
+        <w:tc>
+          <w:tcPr>
+            <w:tcW w:type="dxa" w:w="1800"/>
+            <w:tcBorders>
+              <w:top w:val="single" w:color="D5E0D9" w:sz="4"/>
+              <w:left w:val="single" w:color="D5E0D9" w:sz="4"/>
+              <w:bottom w:val="single" w:color="D5E0D9" w:sz="4"/>
+              <w:right w:val="single" w:color="D5E0D9" w:sz="4"/>
+            </w:tcBorders>
+            <w:shd w:fill="FFF1DC" w:color="auto" w:val="clear"/>
+            <w:tcMar>
+              <w:top w:type="dxa" w:w="70"/>
+              <w:left w:type="dxa" w:w="100"/>
+              <w:bottom w:type="dxa" w:w="70"/>
+              <w:right w:type="dxa" w:w="100"/>
+            </w:tcMar>
+            <w:vAlign w:val="center"/>
+          </w:tcPr>
+          <w:p>
+            <w:pPr>
+              <w:spacing w:after="20" w:line="270"/>
+              <w:jc w:val="center"/>
+            </w:pPr>
+            <w:r>
+              <w:rPr>
+                <w:rFonts w:ascii="Arial" w:cs="Arial" w:eastAsia="Arial" w:hAnsi="Arial"/>
+                <w:b/>
+                <w:bCs/>
+                <w:color w:val="9A5B00"/>
+                <w:sz w:val="19"/>
+                <w:szCs w:val="19"/>
+              </w:rPr>
+              <w:t xml:space="preserve">Đang hoàn thiện</w:t>
+            </w:r>
+          </w:p>
+        </w:tc>
+      </w:tr>
+      <w:tr>
+        <w:trPr>
+          <w:cantSplit/>
+        </w:trPr>
+        <w:tc>
+          <w:tcPr>
+            <w:tcW w:type="dxa" w:w="2300"/>
+            <w:tcBorders>
+              <w:top w:val="single" w:color="D5E0D9" w:sz="4"/>
+              <w:left w:val="single" w:color="D5E0D9" w:sz="4"/>
+              <w:bottom w:val="single" w:color="D5E0D9" w:sz="4"/>
+              <w:right w:val="single" w:color="D5E0D9" w:sz="4"/>
+            </w:tcBorders>
+            <w:tcMar>
+              <w:top w:type="dxa" w:w="70"/>
+              <w:left w:type="dxa" w:w="100"/>
+              <w:bottom w:type="dxa" w:w="70"/>
+              <w:right w:type="dxa" w:w="100"/>
+            </w:tcMar>
+            <w:vAlign w:val="center"/>
+          </w:tcPr>
+          <w:p>
+            <w:pPr>
+              <w:spacing w:after="20" w:line="270"/>
+            </w:pPr>
+            <w:r>
+              <w:rPr>
+                <w:rFonts w:ascii="Arial" w:cs="Arial" w:eastAsia="Arial" w:hAnsi="Arial"/>
+                <w:b/>
+                <w:bCs/>
+                <w:sz w:val="19"/>
+                <w:szCs w:val="19"/>
+              </w:rPr>
+              <w:t xml:space="preserve">Đăng App Store / Google Play</w:t>
+            </w:r>
+          </w:p>
+        </w:tc>
+        <w:tc>
+          <w:tcPr>
+            <w:tcW w:type="dxa" w:w="5538"/>
+            <w:tcBorders>
+              <w:top w:val="single" w:color="D5E0D9" w:sz="4"/>
+              <w:left w:val="single" w:color="D5E0D9" w:sz="4"/>
+              <w:bottom w:val="single" w:color="D5E0D9" w:sz="4"/>
+              <w:right w:val="single" w:color="D5E0D9" w:sz="4"/>
+            </w:tcBorders>
+            <w:tcMar>
+              <w:top w:type="dxa" w:w="70"/>
+              <w:left w:type="dxa" w:w="100"/>
+              <w:bottom w:type="dxa" w:w="70"/>
+              <w:right w:type="dxa" w:w="100"/>
+            </w:tcMar>
+            <w:vAlign w:val="center"/>
+          </w:tcPr>
+          <w:p>
+            <w:pPr>
+              <w:spacing w:after="20" w:line="270"/>
+            </w:pPr>
+            <w:r>
+              <w:rPr>
+                <w:rFonts w:ascii="Arial" w:cs="Arial" w:eastAsia="Arial" w:hAnsi="Arial"/>
+                <w:b w:val="false"/>
+                <w:bCs w:val="false"/>
+                <w:sz w:val="19"/>
+                <w:szCs w:val="19"/>
+              </w:rPr>
+              <w:t xml:space="preserve">Chưa nộp store; cần tài khoản Apple Developer và Google Play Console đứng tên chủ sở hữu.</w:t>
             </w:r>
           </w:p>
         </w:tc>
@@ -1795,7 +2138,7 @@
           <w:sz w:val="19"/>
           <w:szCs w:val="19"/>
         </w:rPr>
-        <w:t xml:space="preserve">Ứng dụng đã được kiểm thử tự động (36 kịch bản giao diện, 5 kịch bản máy chủ) và chạy thử toàn luồng đăng ký – hồ sơ – trò chuyện trên máy chủ thử nghiệm.</w:t>
+        <w:t xml:space="preserve">Máy chủ production: https://freelancedienchanapp-production.up.railway.app — /api/v1/health trả ok và mail=true. Kiểm thử tự động giao diện + API đã chạy; luồng đăng ký–hồ sơ–chat đã thử trên server thật.</w:t>
       </w:r>
     </w:p>
     <w:p>
@@ -2895,7 +3238,7 @@
                 <w:sz w:val="20"/>
                 <w:szCs w:val="20"/>
               </w:rPr>
-              <w:t xml:space="preserve">A. Email &amp; tài khoản</w:t>
+              <w:t xml:space="preserve">A. Email &amp; tài khoản store</w:t>
             </w:r>
           </w:p>
         </w:tc>
@@ -3100,7 +3443,7 @@
                 <w:sz w:val="19"/>
                 <w:szCs w:val="19"/>
               </w:rPr>
-              <w:t xml:space="preserve">Email Gmail của chủ sở hữu</w:t>
+              <w:t xml:space="preserve">Email Gmail của chủ sở hữu cho Google Play</w:t>
             </w:r>
           </w:p>
         </w:tc>
@@ -3132,7 +3475,7 @@
                 <w:sz w:val="19"/>
                 <w:szCs w:val="19"/>
               </w:rPr>
-              <w:t xml:space="preserve">Đăng ký Google Play Console</w:t>
+              <w:t xml:space="preserve">Đăng ký Google Play Console (có thể khác mail vận hành kỹ thuật)</w:t>
             </w:r>
           </w:p>
         </w:tc>
@@ -3234,7 +3577,7 @@
                 <w:sz w:val="19"/>
                 <w:szCs w:val="19"/>
               </w:rPr>
-              <w:t xml:space="preserve">Email hỗ trợ công khai</w:t>
+              <w:t xml:space="preserve">Email hỗ trợ công khai trên store</w:t>
             </w:r>
           </w:p>
         </w:tc>
@@ -3368,7 +3711,7 @@
                 <w:sz w:val="19"/>
                 <w:szCs w:val="19"/>
               </w:rPr>
-              <w:t xml:space="preserve">Email nhận thông báo quản trị</w:t>
+              <w:t xml:space="preserve">Xác nhận email nhận thông báo quản trị</w:t>
             </w:r>
           </w:p>
         </w:tc>
@@ -3400,7 +3743,7 @@
                 <w:sz w:val="19"/>
                 <w:szCs w:val="19"/>
               </w:rPr>
-              <w:t xml:space="preserve">Nhận đăng ký khóa học, tin bị báo cáo, yêu cầu hỗ trợ</w:t>
+              <w:t xml:space="preserve">Hiện đang dùng appdienchan@gmail.com — Thầy xác nhận hoặc đổi</w:t>
             </w:r>
           </w:p>
         </w:tc>
@@ -3502,7 +3845,7 @@
                 <w:sz w:val="19"/>
                 <w:szCs w:val="19"/>
               </w:rPr>
-              <w:t xml:space="preserve">Email đăng ký máy chủ Railway và dịch vụ gửi mail Resend</w:t>
+              <w:t xml:space="preserve">Tên miền riêng (nếu có) và người quản lý DNS</w:t>
             </w:r>
           </w:p>
         </w:tc>
@@ -3534,7 +3877,7 @@
                 <w:sz w:val="19"/>
                 <w:szCs w:val="19"/>
               </w:rPr>
-              <w:t xml:space="preserve">Chạy máy chủ, gửi email quên mật khẩu (có thể dùng chung email trên)</w:t>
+              <w:t xml:space="preserve">Gắn Resend để gửi mail quên mật khẩu tới mọi địa chỉ người dùng</w:t>
             </w:r>
           </w:p>
         </w:tc>
@@ -3576,130 +3919,33 @@
         </w:trPr>
         <w:tc>
           <w:tcPr>
-            <w:tcW w:type="dxa" w:w="520"/>
-            <w:tcBorders>
-              <w:top w:val="single" w:color="D5E0D9" w:sz="4"/>
-              <w:left w:val="single" w:color="D5E0D9" w:sz="4"/>
-              <w:bottom w:val="single" w:color="D5E0D9" w:sz="4"/>
-              <w:right w:val="single" w:color="D5E0D9" w:sz="4"/>
-            </w:tcBorders>
-            <w:tcMar>
-              <w:top w:type="dxa" w:w="70"/>
-              <w:left w:type="dxa" w:w="100"/>
-              <w:bottom w:type="dxa" w:w="70"/>
-              <w:right w:type="dxa" w:w="100"/>
-            </w:tcMar>
-            <w:vAlign w:val="center"/>
-          </w:tcPr>
-          <w:p>
-            <w:pPr>
-              <w:spacing w:after="20" w:line="270"/>
-              <w:jc w:val="center"/>
-            </w:pPr>
-            <w:r>
-              <w:rPr>
-                <w:rFonts w:ascii="Arial" w:cs="Arial" w:eastAsia="Arial" w:hAnsi="Arial"/>
-                <w:color w:val="5F6B63"/>
-                <w:sz w:val="19"/>
-                <w:szCs w:val="19"/>
-              </w:rPr>
-              <w:t xml:space="preserve">6</w:t>
-            </w:r>
-          </w:p>
-        </w:tc>
-        <w:tc>
-          <w:tcPr>
-            <w:tcW w:type="dxa" w:w="3500"/>
-            <w:tcBorders>
-              <w:top w:val="single" w:color="D5E0D9" w:sz="4"/>
-              <w:left w:val="single" w:color="D5E0D9" w:sz="4"/>
-              <w:bottom w:val="single" w:color="D5E0D9" w:sz="4"/>
-              <w:right w:val="single" w:color="D5E0D9" w:sz="4"/>
-            </w:tcBorders>
-            <w:tcMar>
-              <w:top w:type="dxa" w:w="70"/>
-              <w:left w:type="dxa" w:w="100"/>
-              <w:bottom w:type="dxa" w:w="70"/>
-              <w:right w:type="dxa" w:w="100"/>
-            </w:tcMar>
-            <w:vAlign w:val="center"/>
-          </w:tcPr>
-          <w:p>
-            <w:pPr>
-              <w:spacing w:after="20" w:line="270"/>
-            </w:pPr>
+            <w:tcW w:type="dxa" w:w="9638"/>
+            <w:gridSpan w:val="4"/>
+            <w:tcBorders>
+              <w:top w:val="single" w:color="D5E0D9" w:sz="4"/>
+              <w:left w:val="single" w:color="D5E0D9" w:sz="4"/>
+              <w:bottom w:val="single" w:color="D5E0D9" w:sz="4"/>
+              <w:right w:val="single" w:color="D5E0D9" w:sz="4"/>
+            </w:tcBorders>
+            <w:shd w:fill="EEF6F1" w:color="auto" w:val="clear"/>
+            <w:tcMar>
+              <w:top w:type="dxa" w:w="60"/>
+              <w:left w:type="dxa" w:w="100"/>
+              <w:bottom w:type="dxa" w:w="60"/>
+              <w:right w:type="dxa" w:w="100"/>
+            </w:tcMar>
+          </w:tcPr>
+          <w:p>
             <w:r>
               <w:rPr>
                 <w:rFonts w:ascii="Arial" w:cs="Arial" w:eastAsia="Arial" w:hAnsi="Arial"/>
                 <w:b/>
                 <w:bCs/>
-                <w:sz w:val="19"/>
-                <w:szCs w:val="19"/>
-              </w:rPr>
-              <w:t xml:space="preserve">Tên miền đang có (nếu có) và người quản lý DNS</w:t>
-            </w:r>
-          </w:p>
-        </w:tc>
-        <w:tc>
-          <w:tcPr>
-            <w:tcW w:type="dxa" w:w="3318"/>
-            <w:tcBorders>
-              <w:top w:val="single" w:color="D5E0D9" w:sz="4"/>
-              <w:left w:val="single" w:color="D5E0D9" w:sz="4"/>
-              <w:bottom w:val="single" w:color="D5E0D9" w:sz="4"/>
-              <w:right w:val="single" w:color="D5E0D9" w:sz="4"/>
-            </w:tcBorders>
-            <w:tcMar>
-              <w:top w:type="dxa" w:w="70"/>
-              <w:left w:type="dxa" w:w="100"/>
-              <w:bottom w:type="dxa" w:w="70"/>
-              <w:right w:type="dxa" w:w="100"/>
-            </w:tcMar>
-            <w:vAlign w:val="center"/>
-          </w:tcPr>
-          <w:p>
-            <w:pPr>
-              <w:spacing w:after="20" w:line="270"/>
-            </w:pPr>
-            <w:r>
-              <w:rPr>
-                <w:rFonts w:ascii="Arial" w:cs="Arial" w:eastAsia="Arial" w:hAnsi="Arial"/>
-                <w:color w:val="5F6B63"/>
-                <w:sz w:val="19"/>
-                <w:szCs w:val="19"/>
-              </w:rPr>
-              <w:t xml:space="preserve">Gửi email từ địa chỉ dạng no-reply@tên-miền; nếu chưa có cần mua</w:t>
-            </w:r>
-          </w:p>
-        </w:tc>
-        <w:tc>
-          <w:tcPr>
-            <w:tcW w:type="dxa" w:w="2300"/>
-            <w:tcBorders>
-              <w:top w:val="single" w:color="D5E0D9" w:sz="4"/>
-              <w:left w:val="single" w:color="D5E0D9" w:sz="4"/>
-              <w:bottom w:val="single" w:color="D5E0D9" w:sz="4"/>
-              <w:right w:val="single" w:color="D5E0D9" w:sz="4"/>
-            </w:tcBorders>
-            <w:tcMar>
-              <w:top w:type="dxa" w:w="70"/>
-              <w:left w:type="dxa" w:w="100"/>
-              <w:bottom w:type="dxa" w:w="70"/>
-              <w:right w:type="dxa" w:w="100"/>
-            </w:tcMar>
-            <w:vAlign w:val="center"/>
-          </w:tcPr>
-          <w:p>
-            <w:pPr>
-              <w:spacing w:after="20" w:line="270"/>
-            </w:pPr>
-            <w:r>
-              <w:rPr>
-                <w:rFonts w:ascii="Arial" w:cs="Arial" w:eastAsia="Arial" w:hAnsi="Arial"/>
-                <w:sz w:val="19"/>
-                <w:szCs w:val="19"/>
-              </w:rPr>
-              <w:t xml:space="preserve"/>
+                <w:color w:val="1E4F38"/>
+                <w:sz w:val="20"/>
+                <w:szCs w:val="20"/>
+              </w:rPr>
+              <w:t xml:space="preserve">B. Thông tin pháp lý</w:t>
             </w:r>
           </w:p>
         </w:tc>
@@ -3710,6 +3956,542 @@
         </w:trPr>
         <w:tc>
           <w:tcPr>
+            <w:tcW w:type="dxa" w:w="520"/>
+            <w:tcBorders>
+              <w:top w:val="single" w:color="D5E0D9" w:sz="4"/>
+              <w:left w:val="single" w:color="D5E0D9" w:sz="4"/>
+              <w:bottom w:val="single" w:color="D5E0D9" w:sz="4"/>
+              <w:right w:val="single" w:color="D5E0D9" w:sz="4"/>
+            </w:tcBorders>
+            <w:tcMar>
+              <w:top w:type="dxa" w:w="70"/>
+              <w:left w:type="dxa" w:w="100"/>
+              <w:bottom w:type="dxa" w:w="70"/>
+              <w:right w:type="dxa" w:w="100"/>
+            </w:tcMar>
+            <w:vAlign w:val="center"/>
+          </w:tcPr>
+          <w:p>
+            <w:pPr>
+              <w:spacing w:after="20" w:line="270"/>
+              <w:jc w:val="center"/>
+            </w:pPr>
+            <w:r>
+              <w:rPr>
+                <w:rFonts w:ascii="Arial" w:cs="Arial" w:eastAsia="Arial" w:hAnsi="Arial"/>
+                <w:color w:val="5F6B63"/>
+                <w:sz w:val="19"/>
+                <w:szCs w:val="19"/>
+              </w:rPr>
+              <w:t xml:space="preserve">6</w:t>
+            </w:r>
+          </w:p>
+        </w:tc>
+        <w:tc>
+          <w:tcPr>
+            <w:tcW w:type="dxa" w:w="3500"/>
+            <w:tcBorders>
+              <w:top w:val="single" w:color="D5E0D9" w:sz="4"/>
+              <w:left w:val="single" w:color="D5E0D9" w:sz="4"/>
+              <w:bottom w:val="single" w:color="D5E0D9" w:sz="4"/>
+              <w:right w:val="single" w:color="D5E0D9" w:sz="4"/>
+            </w:tcBorders>
+            <w:tcMar>
+              <w:top w:type="dxa" w:w="70"/>
+              <w:left w:type="dxa" w:w="100"/>
+              <w:bottom w:type="dxa" w:w="70"/>
+              <w:right w:type="dxa" w:w="100"/>
+            </w:tcMar>
+            <w:vAlign w:val="center"/>
+          </w:tcPr>
+          <w:p>
+            <w:pPr>
+              <w:spacing w:after="20" w:line="270"/>
+            </w:pPr>
+            <w:r>
+              <w:rPr>
+                <w:rFonts w:ascii="Arial" w:cs="Arial" w:eastAsia="Arial" w:hAnsi="Arial"/>
+                <w:b/>
+                <w:bCs/>
+                <w:sz w:val="19"/>
+                <w:szCs w:val="19"/>
+              </w:rPr>
+              <w:t xml:space="preserve">Loại tài khoản: Cá nhân hay Tổ chức (xem mục 2.3)</w:t>
+            </w:r>
+          </w:p>
+        </w:tc>
+        <w:tc>
+          <w:tcPr>
+            <w:tcW w:type="dxa" w:w="3318"/>
+            <w:tcBorders>
+              <w:top w:val="single" w:color="D5E0D9" w:sz="4"/>
+              <w:left w:val="single" w:color="D5E0D9" w:sz="4"/>
+              <w:bottom w:val="single" w:color="D5E0D9" w:sz="4"/>
+              <w:right w:val="single" w:color="D5E0D9" w:sz="4"/>
+            </w:tcBorders>
+            <w:tcMar>
+              <w:top w:type="dxa" w:w="70"/>
+              <w:left w:type="dxa" w:w="100"/>
+              <w:bottom w:type="dxa" w:w="70"/>
+              <w:right w:type="dxa" w:w="100"/>
+            </w:tcMar>
+            <w:vAlign w:val="center"/>
+          </w:tcPr>
+          <w:p>
+            <w:pPr>
+              <w:spacing w:after="20" w:line="270"/>
+            </w:pPr>
+            <w:r>
+              <w:rPr>
+                <w:rFonts w:ascii="Arial" w:cs="Arial" w:eastAsia="Arial" w:hAnsi="Arial"/>
+                <w:color w:val="5F6B63"/>
+                <w:sz w:val="19"/>
+                <w:szCs w:val="19"/>
+              </w:rPr>
+              <w:t xml:space="preserve">Quyết định thủ tục và thời gian đăng ký</w:t>
+            </w:r>
+          </w:p>
+        </w:tc>
+        <w:tc>
+          <w:tcPr>
+            <w:tcW w:type="dxa" w:w="2300"/>
+            <w:tcBorders>
+              <w:top w:val="single" w:color="D5E0D9" w:sz="4"/>
+              <w:left w:val="single" w:color="D5E0D9" w:sz="4"/>
+              <w:bottom w:val="single" w:color="D5E0D9" w:sz="4"/>
+              <w:right w:val="single" w:color="D5E0D9" w:sz="4"/>
+            </w:tcBorders>
+            <w:tcMar>
+              <w:top w:type="dxa" w:w="70"/>
+              <w:left w:type="dxa" w:w="100"/>
+              <w:bottom w:type="dxa" w:w="70"/>
+              <w:right w:type="dxa" w:w="100"/>
+            </w:tcMar>
+            <w:vAlign w:val="center"/>
+          </w:tcPr>
+          <w:p>
+            <w:pPr>
+              <w:spacing w:after="20" w:line="270"/>
+            </w:pPr>
+            <w:r>
+              <w:rPr>
+                <w:rFonts w:ascii="Arial" w:cs="Arial" w:eastAsia="Arial" w:hAnsi="Arial"/>
+                <w:sz w:val="19"/>
+                <w:szCs w:val="19"/>
+              </w:rPr>
+              <w:t xml:space="preserve"/>
+            </w:r>
+          </w:p>
+        </w:tc>
+      </w:tr>
+      <w:tr>
+        <w:trPr>
+          <w:cantSplit/>
+        </w:trPr>
+        <w:tc>
+          <w:tcPr>
+            <w:tcW w:type="dxa" w:w="520"/>
+            <w:tcBorders>
+              <w:top w:val="single" w:color="D5E0D9" w:sz="4"/>
+              <w:left w:val="single" w:color="D5E0D9" w:sz="4"/>
+              <w:bottom w:val="single" w:color="D5E0D9" w:sz="4"/>
+              <w:right w:val="single" w:color="D5E0D9" w:sz="4"/>
+            </w:tcBorders>
+            <w:tcMar>
+              <w:top w:type="dxa" w:w="70"/>
+              <w:left w:type="dxa" w:w="100"/>
+              <w:bottom w:type="dxa" w:w="70"/>
+              <w:right w:type="dxa" w:w="100"/>
+            </w:tcMar>
+            <w:vAlign w:val="center"/>
+          </w:tcPr>
+          <w:p>
+            <w:pPr>
+              <w:spacing w:after="20" w:line="270"/>
+              <w:jc w:val="center"/>
+            </w:pPr>
+            <w:r>
+              <w:rPr>
+                <w:rFonts w:ascii="Arial" w:cs="Arial" w:eastAsia="Arial" w:hAnsi="Arial"/>
+                <w:color w:val="5F6B63"/>
+                <w:sz w:val="19"/>
+                <w:szCs w:val="19"/>
+              </w:rPr>
+              <w:t xml:space="preserve">7</w:t>
+            </w:r>
+          </w:p>
+        </w:tc>
+        <w:tc>
+          <w:tcPr>
+            <w:tcW w:type="dxa" w:w="3500"/>
+            <w:tcBorders>
+              <w:top w:val="single" w:color="D5E0D9" w:sz="4"/>
+              <w:left w:val="single" w:color="D5E0D9" w:sz="4"/>
+              <w:bottom w:val="single" w:color="D5E0D9" w:sz="4"/>
+              <w:right w:val="single" w:color="D5E0D9" w:sz="4"/>
+            </w:tcBorders>
+            <w:tcMar>
+              <w:top w:type="dxa" w:w="70"/>
+              <w:left w:type="dxa" w:w="100"/>
+              <w:bottom w:type="dxa" w:w="70"/>
+              <w:right w:type="dxa" w:w="100"/>
+            </w:tcMar>
+            <w:vAlign w:val="center"/>
+          </w:tcPr>
+          <w:p>
+            <w:pPr>
+              <w:spacing w:after="20" w:line="270"/>
+            </w:pPr>
+            <w:r>
+              <w:rPr>
+                <w:rFonts w:ascii="Arial" w:cs="Arial" w:eastAsia="Arial" w:hAnsi="Arial"/>
+                <w:b/>
+                <w:bCs/>
+                <w:sz w:val="19"/>
+                <w:szCs w:val="19"/>
+              </w:rPr>
+              <w:t xml:space="preserve">Tên hiển thị là nhà phát triển trên store</w:t>
+            </w:r>
+          </w:p>
+        </w:tc>
+        <w:tc>
+          <w:tcPr>
+            <w:tcW w:type="dxa" w:w="3318"/>
+            <w:tcBorders>
+              <w:top w:val="single" w:color="D5E0D9" w:sz="4"/>
+              <w:left w:val="single" w:color="D5E0D9" w:sz="4"/>
+              <w:bottom w:val="single" w:color="D5E0D9" w:sz="4"/>
+              <w:right w:val="single" w:color="D5E0D9" w:sz="4"/>
+            </w:tcBorders>
+            <w:tcMar>
+              <w:top w:type="dxa" w:w="70"/>
+              <w:left w:type="dxa" w:w="100"/>
+              <w:bottom w:type="dxa" w:w="70"/>
+              <w:right w:type="dxa" w:w="100"/>
+            </w:tcMar>
+            <w:vAlign w:val="center"/>
+          </w:tcPr>
+          <w:p>
+            <w:pPr>
+              <w:spacing w:after="20" w:line="270"/>
+            </w:pPr>
+            <w:r>
+              <w:rPr>
+                <w:rFonts w:ascii="Arial" w:cs="Arial" w:eastAsia="Arial" w:hAnsi="Arial"/>
+                <w:color w:val="5F6B63"/>
+                <w:sz w:val="19"/>
+                <w:szCs w:val="19"/>
+              </w:rPr>
+              <w:t xml:space="preserve">Ví dụ: tên Thầy hoặc tên trung tâm</w:t>
+            </w:r>
+          </w:p>
+        </w:tc>
+        <w:tc>
+          <w:tcPr>
+            <w:tcW w:type="dxa" w:w="2300"/>
+            <w:tcBorders>
+              <w:top w:val="single" w:color="D5E0D9" w:sz="4"/>
+              <w:left w:val="single" w:color="D5E0D9" w:sz="4"/>
+              <w:bottom w:val="single" w:color="D5E0D9" w:sz="4"/>
+              <w:right w:val="single" w:color="D5E0D9" w:sz="4"/>
+            </w:tcBorders>
+            <w:tcMar>
+              <w:top w:type="dxa" w:w="70"/>
+              <w:left w:type="dxa" w:w="100"/>
+              <w:bottom w:type="dxa" w:w="70"/>
+              <w:right w:type="dxa" w:w="100"/>
+            </w:tcMar>
+            <w:vAlign w:val="center"/>
+          </w:tcPr>
+          <w:p>
+            <w:pPr>
+              <w:spacing w:after="20" w:line="270"/>
+            </w:pPr>
+            <w:r>
+              <w:rPr>
+                <w:rFonts w:ascii="Arial" w:cs="Arial" w:eastAsia="Arial" w:hAnsi="Arial"/>
+                <w:sz w:val="19"/>
+                <w:szCs w:val="19"/>
+              </w:rPr>
+              <w:t xml:space="preserve"/>
+            </w:r>
+          </w:p>
+        </w:tc>
+      </w:tr>
+      <w:tr>
+        <w:trPr>
+          <w:cantSplit/>
+        </w:trPr>
+        <w:tc>
+          <w:tcPr>
+            <w:tcW w:type="dxa" w:w="520"/>
+            <w:tcBorders>
+              <w:top w:val="single" w:color="D5E0D9" w:sz="4"/>
+              <w:left w:val="single" w:color="D5E0D9" w:sz="4"/>
+              <w:bottom w:val="single" w:color="D5E0D9" w:sz="4"/>
+              <w:right w:val="single" w:color="D5E0D9" w:sz="4"/>
+            </w:tcBorders>
+            <w:tcMar>
+              <w:top w:type="dxa" w:w="70"/>
+              <w:left w:type="dxa" w:w="100"/>
+              <w:bottom w:type="dxa" w:w="70"/>
+              <w:right w:type="dxa" w:w="100"/>
+            </w:tcMar>
+            <w:vAlign w:val="center"/>
+          </w:tcPr>
+          <w:p>
+            <w:pPr>
+              <w:spacing w:after="20" w:line="270"/>
+              <w:jc w:val="center"/>
+            </w:pPr>
+            <w:r>
+              <w:rPr>
+                <w:rFonts w:ascii="Arial" w:cs="Arial" w:eastAsia="Arial" w:hAnsi="Arial"/>
+                <w:color w:val="5F6B63"/>
+                <w:sz w:val="19"/>
+                <w:szCs w:val="19"/>
+              </w:rPr>
+              <w:t xml:space="preserve">8</w:t>
+            </w:r>
+          </w:p>
+        </w:tc>
+        <w:tc>
+          <w:tcPr>
+            <w:tcW w:type="dxa" w:w="3500"/>
+            <w:tcBorders>
+              <w:top w:val="single" w:color="D5E0D9" w:sz="4"/>
+              <w:left w:val="single" w:color="D5E0D9" w:sz="4"/>
+              <w:bottom w:val="single" w:color="D5E0D9" w:sz="4"/>
+              <w:right w:val="single" w:color="D5E0D9" w:sz="4"/>
+            </w:tcBorders>
+            <w:tcMar>
+              <w:top w:type="dxa" w:w="70"/>
+              <w:left w:type="dxa" w:w="100"/>
+              <w:bottom w:type="dxa" w:w="70"/>
+              <w:right w:type="dxa" w:w="100"/>
+            </w:tcMar>
+            <w:vAlign w:val="center"/>
+          </w:tcPr>
+          <w:p>
+            <w:pPr>
+              <w:spacing w:after="20" w:line="270"/>
+            </w:pPr>
+            <w:r>
+              <w:rPr>
+                <w:rFonts w:ascii="Arial" w:cs="Arial" w:eastAsia="Arial" w:hAnsi="Arial"/>
+                <w:b/>
+                <w:bCs/>
+                <w:sz w:val="19"/>
+                <w:szCs w:val="19"/>
+              </w:rPr>
+              <w:t xml:space="preserve">Địa chỉ và số điện thoại liên hệ</w:t>
+            </w:r>
+          </w:p>
+        </w:tc>
+        <w:tc>
+          <w:tcPr>
+            <w:tcW w:type="dxa" w:w="3318"/>
+            <w:tcBorders>
+              <w:top w:val="single" w:color="D5E0D9" w:sz="4"/>
+              <w:left w:val="single" w:color="D5E0D9" w:sz="4"/>
+              <w:bottom w:val="single" w:color="D5E0D9" w:sz="4"/>
+              <w:right w:val="single" w:color="D5E0D9" w:sz="4"/>
+            </w:tcBorders>
+            <w:tcMar>
+              <w:top w:type="dxa" w:w="70"/>
+              <w:left w:type="dxa" w:w="100"/>
+              <w:bottom w:type="dxa" w:w="70"/>
+              <w:right w:type="dxa" w:w="100"/>
+            </w:tcMar>
+            <w:vAlign w:val="center"/>
+          </w:tcPr>
+          <w:p>
+            <w:pPr>
+              <w:spacing w:after="20" w:line="270"/>
+            </w:pPr>
+            <w:r>
+              <w:rPr>
+                <w:rFonts w:ascii="Arial" w:cs="Arial" w:eastAsia="Arial" w:hAnsi="Arial"/>
+                <w:color w:val="5F6B63"/>
+                <w:sz w:val="19"/>
+                <w:szCs w:val="19"/>
+              </w:rPr>
+              <w:t xml:space="preserve">Apple/Google xác minh danh tính; hiện app dùng hotline 0903.888.397 và địa chỉ 16 Kỳ Con – vui lòng xác nhận</w:t>
+            </w:r>
+          </w:p>
+        </w:tc>
+        <w:tc>
+          <w:tcPr>
+            <w:tcW w:type="dxa" w:w="2300"/>
+            <w:tcBorders>
+              <w:top w:val="single" w:color="D5E0D9" w:sz="4"/>
+              <w:left w:val="single" w:color="D5E0D9" w:sz="4"/>
+              <w:bottom w:val="single" w:color="D5E0D9" w:sz="4"/>
+              <w:right w:val="single" w:color="D5E0D9" w:sz="4"/>
+            </w:tcBorders>
+            <w:tcMar>
+              <w:top w:type="dxa" w:w="70"/>
+              <w:left w:type="dxa" w:w="100"/>
+              <w:bottom w:type="dxa" w:w="70"/>
+              <w:right w:type="dxa" w:w="100"/>
+            </w:tcMar>
+            <w:vAlign w:val="center"/>
+          </w:tcPr>
+          <w:p>
+            <w:pPr>
+              <w:spacing w:after="20" w:line="270"/>
+            </w:pPr>
+            <w:r>
+              <w:rPr>
+                <w:rFonts w:ascii="Arial" w:cs="Arial" w:eastAsia="Arial" w:hAnsi="Arial"/>
+                <w:sz w:val="19"/>
+                <w:szCs w:val="19"/>
+              </w:rPr>
+              <w:t xml:space="preserve"/>
+            </w:r>
+          </w:p>
+        </w:tc>
+      </w:tr>
+      <w:tr>
+        <w:trPr>
+          <w:cantSplit/>
+        </w:trPr>
+        <w:tc>
+          <w:tcPr>
+            <w:tcW w:type="dxa" w:w="520"/>
+            <w:tcBorders>
+              <w:top w:val="single" w:color="D5E0D9" w:sz="4"/>
+              <w:left w:val="single" w:color="D5E0D9" w:sz="4"/>
+              <w:bottom w:val="single" w:color="D5E0D9" w:sz="4"/>
+              <w:right w:val="single" w:color="D5E0D9" w:sz="4"/>
+            </w:tcBorders>
+            <w:tcMar>
+              <w:top w:type="dxa" w:w="70"/>
+              <w:left w:type="dxa" w:w="100"/>
+              <w:bottom w:type="dxa" w:w="70"/>
+              <w:right w:type="dxa" w:w="100"/>
+            </w:tcMar>
+            <w:vAlign w:val="center"/>
+          </w:tcPr>
+          <w:p>
+            <w:pPr>
+              <w:spacing w:after="20" w:line="270"/>
+              <w:jc w:val="center"/>
+            </w:pPr>
+            <w:r>
+              <w:rPr>
+                <w:rFonts w:ascii="Arial" w:cs="Arial" w:eastAsia="Arial" w:hAnsi="Arial"/>
+                <w:color w:val="5F6B63"/>
+                <w:sz w:val="19"/>
+                <w:szCs w:val="19"/>
+              </w:rPr>
+              <w:t xml:space="preserve">9</w:t>
+            </w:r>
+          </w:p>
+        </w:tc>
+        <w:tc>
+          <w:tcPr>
+            <w:tcW w:type="dxa" w:w="3500"/>
+            <w:tcBorders>
+              <w:top w:val="single" w:color="D5E0D9" w:sz="4"/>
+              <w:left w:val="single" w:color="D5E0D9" w:sz="4"/>
+              <w:bottom w:val="single" w:color="D5E0D9" w:sz="4"/>
+              <w:right w:val="single" w:color="D5E0D9" w:sz="4"/>
+            </w:tcBorders>
+            <w:tcMar>
+              <w:top w:type="dxa" w:w="70"/>
+              <w:left w:type="dxa" w:w="100"/>
+              <w:bottom w:type="dxa" w:w="70"/>
+              <w:right w:type="dxa" w:w="100"/>
+            </w:tcMar>
+            <w:vAlign w:val="center"/>
+          </w:tcPr>
+          <w:p>
+            <w:pPr>
+              <w:spacing w:after="20" w:line="270"/>
+            </w:pPr>
+            <w:r>
+              <w:rPr>
+                <w:rFonts w:ascii="Arial" w:cs="Arial" w:eastAsia="Arial" w:hAnsi="Arial"/>
+                <w:b/>
+                <w:bCs/>
+                <w:sz w:val="19"/>
+                <w:szCs w:val="19"/>
+              </w:rPr>
+              <w:t xml:space="preserve">Nếu là tổ chức: tên pháp lý, mã số D-U-N-S, website</w:t>
+            </w:r>
+          </w:p>
+        </w:tc>
+        <w:tc>
+          <w:tcPr>
+            <w:tcW w:type="dxa" w:w="3318"/>
+            <w:tcBorders>
+              <w:top w:val="single" w:color="D5E0D9" w:sz="4"/>
+              <w:left w:val="single" w:color="D5E0D9" w:sz="4"/>
+              <w:bottom w:val="single" w:color="D5E0D9" w:sz="4"/>
+              <w:right w:val="single" w:color="D5E0D9" w:sz="4"/>
+            </w:tcBorders>
+            <w:tcMar>
+              <w:top w:type="dxa" w:w="70"/>
+              <w:left w:type="dxa" w:w="100"/>
+              <w:bottom w:type="dxa" w:w="70"/>
+              <w:right w:type="dxa" w:w="100"/>
+            </w:tcMar>
+            <w:vAlign w:val="center"/>
+          </w:tcPr>
+          <w:p>
+            <w:pPr>
+              <w:spacing w:after="20" w:line="270"/>
+            </w:pPr>
+            <w:r>
+              <w:rPr>
+                <w:rFonts w:ascii="Arial" w:cs="Arial" w:eastAsia="Arial" w:hAnsi="Arial"/>
+                <w:color w:val="5F6B63"/>
+                <w:sz w:val="19"/>
+                <w:szCs w:val="19"/>
+              </w:rPr>
+              <w:t xml:space="preserve">Bắt buộc với tài khoản tổ chức trên cả Apple và Google</w:t>
+            </w:r>
+          </w:p>
+        </w:tc>
+        <w:tc>
+          <w:tcPr>
+            <w:tcW w:type="dxa" w:w="2300"/>
+            <w:tcBorders>
+              <w:top w:val="single" w:color="D5E0D9" w:sz="4"/>
+              <w:left w:val="single" w:color="D5E0D9" w:sz="4"/>
+              <w:bottom w:val="single" w:color="D5E0D9" w:sz="4"/>
+              <w:right w:val="single" w:color="D5E0D9" w:sz="4"/>
+            </w:tcBorders>
+            <w:tcMar>
+              <w:top w:type="dxa" w:w="70"/>
+              <w:left w:type="dxa" w:w="100"/>
+              <w:bottom w:type="dxa" w:w="70"/>
+              <w:right w:type="dxa" w:w="100"/>
+            </w:tcMar>
+            <w:vAlign w:val="center"/>
+          </w:tcPr>
+          <w:p>
+            <w:pPr>
+              <w:spacing w:after="20" w:line="270"/>
+            </w:pPr>
+            <w:r>
+              <w:rPr>
+                <w:rFonts w:ascii="Arial" w:cs="Arial" w:eastAsia="Arial" w:hAnsi="Arial"/>
+                <w:sz w:val="19"/>
+                <w:szCs w:val="19"/>
+              </w:rPr>
+              <w:t xml:space="preserve"/>
+            </w:r>
+          </w:p>
+        </w:tc>
+      </w:tr>
+      <w:tr>
+        <w:trPr>
+          <w:cantSplit/>
+        </w:trPr>
+        <w:tc>
+          <w:tcPr>
             <w:tcW w:type="dxa" w:w="9638"/>
             <w:gridSpan w:val="4"/>
             <w:tcBorders>
@@ -3736,7 +4518,7 @@
                 <w:sz w:val="20"/>
                 <w:szCs w:val="20"/>
               </w:rPr>
-              <w:t xml:space="preserve">B. Thông tin pháp lý</w:t>
+              <w:t xml:space="preserve">C. Thử nghiệm</w:t>
             </w:r>
           </w:p>
         </w:tc>
@@ -3774,7 +4556,7 @@
                 <w:sz w:val="19"/>
                 <w:szCs w:val="19"/>
               </w:rPr>
-              <w:t xml:space="preserve">7</w:t>
+              <w:t xml:space="preserve">10</w:t>
             </w:r>
           </w:p>
         </w:tc>
@@ -3807,7 +4589,7 @@
                 <w:sz w:val="19"/>
                 <w:szCs w:val="19"/>
               </w:rPr>
-              <w:t xml:space="preserve">Loại tài khoản: Cá nhân hay Tổ chức (xem mục 2.3)</w:t>
+              <w:t xml:space="preserve">Danh sách tối thiểu 12 địa chỉ Gmail người thử</w:t>
             </w:r>
           </w:p>
         </w:tc>
@@ -3839,7 +4621,7 @@
                 <w:sz w:val="19"/>
                 <w:szCs w:val="19"/>
               </w:rPr>
-              <w:t xml:space="preserve">Quyết định thủ tục và thời gian đăng ký</w:t>
+              <w:t xml:space="preserve">Google bắt buộc thử nghiệm kín 14 ngày (tài khoản cá nhân)</w:t>
             </w:r>
           </w:p>
         </w:tc>
@@ -3908,7 +4690,7 @@
                 <w:sz w:val="19"/>
                 <w:szCs w:val="19"/>
               </w:rPr>
-              <w:t xml:space="preserve">8</w:t>
+              <w:t xml:space="preserve">11</w:t>
             </w:r>
           </w:p>
         </w:tc>
@@ -3941,7 +4723,7 @@
                 <w:sz w:val="19"/>
                 <w:szCs w:val="19"/>
               </w:rPr>
-              <w:t xml:space="preserve">Tên hiển thị là nhà phát triển trên store</w:t>
+              <w:t xml:space="preserve">Email Apple ID người thử iPhone (tùy chọn)</w:t>
             </w:r>
           </w:p>
         </w:tc>
@@ -3973,7 +4755,7 @@
                 <w:sz w:val="19"/>
                 <w:szCs w:val="19"/>
               </w:rPr>
-              <w:t xml:space="preserve">Ví dụ: tên Thầy hoặc tên trung tâm</w:t>
+              <w:t xml:space="preserve">Cài bản thử qua TestFlight</w:t>
             </w:r>
           </w:p>
         </w:tc>
@@ -4015,130 +4797,33 @@
         </w:trPr>
         <w:tc>
           <w:tcPr>
-            <w:tcW w:type="dxa" w:w="520"/>
-            <w:tcBorders>
-              <w:top w:val="single" w:color="D5E0D9" w:sz="4"/>
-              <w:left w:val="single" w:color="D5E0D9" w:sz="4"/>
-              <w:bottom w:val="single" w:color="D5E0D9" w:sz="4"/>
-              <w:right w:val="single" w:color="D5E0D9" w:sz="4"/>
-            </w:tcBorders>
-            <w:tcMar>
-              <w:top w:type="dxa" w:w="70"/>
-              <w:left w:type="dxa" w:w="100"/>
-              <w:bottom w:type="dxa" w:w="70"/>
-              <w:right w:type="dxa" w:w="100"/>
-            </w:tcMar>
-            <w:vAlign w:val="center"/>
-          </w:tcPr>
-          <w:p>
-            <w:pPr>
-              <w:spacing w:after="20" w:line="270"/>
-              <w:jc w:val="center"/>
-            </w:pPr>
-            <w:r>
-              <w:rPr>
-                <w:rFonts w:ascii="Arial" w:cs="Arial" w:eastAsia="Arial" w:hAnsi="Arial"/>
-                <w:color w:val="5F6B63"/>
-                <w:sz w:val="19"/>
-                <w:szCs w:val="19"/>
-              </w:rPr>
-              <w:t xml:space="preserve">9</w:t>
-            </w:r>
-          </w:p>
-        </w:tc>
-        <w:tc>
-          <w:tcPr>
-            <w:tcW w:type="dxa" w:w="3500"/>
-            <w:tcBorders>
-              <w:top w:val="single" w:color="D5E0D9" w:sz="4"/>
-              <w:left w:val="single" w:color="D5E0D9" w:sz="4"/>
-              <w:bottom w:val="single" w:color="D5E0D9" w:sz="4"/>
-              <w:right w:val="single" w:color="D5E0D9" w:sz="4"/>
-            </w:tcBorders>
-            <w:tcMar>
-              <w:top w:type="dxa" w:w="70"/>
-              <w:left w:type="dxa" w:w="100"/>
-              <w:bottom w:type="dxa" w:w="70"/>
-              <w:right w:type="dxa" w:w="100"/>
-            </w:tcMar>
-            <w:vAlign w:val="center"/>
-          </w:tcPr>
-          <w:p>
-            <w:pPr>
-              <w:spacing w:after="20" w:line="270"/>
-            </w:pPr>
+            <w:tcW w:type="dxa" w:w="9638"/>
+            <w:gridSpan w:val="4"/>
+            <w:tcBorders>
+              <w:top w:val="single" w:color="D5E0D9" w:sz="4"/>
+              <w:left w:val="single" w:color="D5E0D9" w:sz="4"/>
+              <w:bottom w:val="single" w:color="D5E0D9" w:sz="4"/>
+              <w:right w:val="single" w:color="D5E0D9" w:sz="4"/>
+            </w:tcBorders>
+            <w:shd w:fill="EEF6F1" w:color="auto" w:val="clear"/>
+            <w:tcMar>
+              <w:top w:type="dxa" w:w="60"/>
+              <w:left w:type="dxa" w:w="100"/>
+              <w:bottom w:type="dxa" w:w="60"/>
+              <w:right w:type="dxa" w:w="100"/>
+            </w:tcMar>
+          </w:tcPr>
+          <w:p>
             <w:r>
               <w:rPr>
                 <w:rFonts w:ascii="Arial" w:cs="Arial" w:eastAsia="Arial" w:hAnsi="Arial"/>
                 <w:b/>
                 <w:bCs/>
-                <w:sz w:val="19"/>
-                <w:szCs w:val="19"/>
-              </w:rPr>
-              <w:t xml:space="preserve">Địa chỉ và số điện thoại liên hệ</w:t>
-            </w:r>
-          </w:p>
-        </w:tc>
-        <w:tc>
-          <w:tcPr>
-            <w:tcW w:type="dxa" w:w="3318"/>
-            <w:tcBorders>
-              <w:top w:val="single" w:color="D5E0D9" w:sz="4"/>
-              <w:left w:val="single" w:color="D5E0D9" w:sz="4"/>
-              <w:bottom w:val="single" w:color="D5E0D9" w:sz="4"/>
-              <w:right w:val="single" w:color="D5E0D9" w:sz="4"/>
-            </w:tcBorders>
-            <w:tcMar>
-              <w:top w:type="dxa" w:w="70"/>
-              <w:left w:type="dxa" w:w="100"/>
-              <w:bottom w:type="dxa" w:w="70"/>
-              <w:right w:type="dxa" w:w="100"/>
-            </w:tcMar>
-            <w:vAlign w:val="center"/>
-          </w:tcPr>
-          <w:p>
-            <w:pPr>
-              <w:spacing w:after="20" w:line="270"/>
-            </w:pPr>
-            <w:r>
-              <w:rPr>
-                <w:rFonts w:ascii="Arial" w:cs="Arial" w:eastAsia="Arial" w:hAnsi="Arial"/>
-                <w:color w:val="5F6B63"/>
-                <w:sz w:val="19"/>
-                <w:szCs w:val="19"/>
-              </w:rPr>
-              <w:t xml:space="preserve">Apple/Google xác minh danh tính; hiện app dùng hotline 0903.888.397 và địa chỉ 16 Kỳ Con – vui lòng xác nhận</w:t>
-            </w:r>
-          </w:p>
-        </w:tc>
-        <w:tc>
-          <w:tcPr>
-            <w:tcW w:type="dxa" w:w="2300"/>
-            <w:tcBorders>
-              <w:top w:val="single" w:color="D5E0D9" w:sz="4"/>
-              <w:left w:val="single" w:color="D5E0D9" w:sz="4"/>
-              <w:bottom w:val="single" w:color="D5E0D9" w:sz="4"/>
-              <w:right w:val="single" w:color="D5E0D9" w:sz="4"/>
-            </w:tcBorders>
-            <w:tcMar>
-              <w:top w:type="dxa" w:w="70"/>
-              <w:left w:type="dxa" w:w="100"/>
-              <w:bottom w:type="dxa" w:w="70"/>
-              <w:right w:type="dxa" w:w="100"/>
-            </w:tcMar>
-            <w:vAlign w:val="center"/>
-          </w:tcPr>
-          <w:p>
-            <w:pPr>
-              <w:spacing w:after="20" w:line="270"/>
-            </w:pPr>
-            <w:r>
-              <w:rPr>
-                <w:rFonts w:ascii="Arial" w:cs="Arial" w:eastAsia="Arial" w:hAnsi="Arial"/>
-                <w:sz w:val="19"/>
-                <w:szCs w:val="19"/>
-              </w:rPr>
-              <w:t xml:space="preserve"/>
+                <w:color w:val="1E4F38"/>
+                <w:sz w:val="20"/>
+                <w:szCs w:val="20"/>
+              </w:rPr>
+              <w:t xml:space="preserve">D. Nội dung</w:t>
             </w:r>
           </w:p>
         </w:tc>
@@ -4176,7 +4861,7 @@
                 <w:sz w:val="19"/>
                 <w:szCs w:val="19"/>
               </w:rPr>
-              <w:t xml:space="preserve">10</w:t>
+              <w:t xml:space="preserve">12</w:t>
             </w:r>
           </w:p>
         </w:tc>
@@ -4209,7 +4894,7 @@
                 <w:sz w:val="19"/>
                 <w:szCs w:val="19"/>
               </w:rPr>
-              <w:t xml:space="preserve">Nếu là tổ chức: tên pháp lý, mã số D-U-N-S, website</w:t>
+              <w:t xml:space="preserve">Phác đồ muốn bổ sung thêm (ảnh chụp trang sách, ghi số trang) – tùy chọn</w:t>
             </w:r>
           </w:p>
         </w:tc>
@@ -4241,7 +4926,7 @@
                 <w:sz w:val="19"/>
                 <w:szCs w:val="19"/>
               </w:rPr>
-              <w:t xml:space="preserve">Bắt buộc với tài khoản tổ chức trên cả Apple và Google</w:t>
+              <w:t xml:space="preserve">Mở rộng thư viện phác đồ trong ứng dụng</w:t>
             </w:r>
           </w:p>
         </w:tc>
@@ -4283,43 +4968,6 @@
         </w:trPr>
         <w:tc>
           <w:tcPr>
-            <w:tcW w:type="dxa" w:w="9638"/>
-            <w:gridSpan w:val="4"/>
-            <w:tcBorders>
-              <w:top w:val="single" w:color="D5E0D9" w:sz="4"/>
-              <w:left w:val="single" w:color="D5E0D9" w:sz="4"/>
-              <w:bottom w:val="single" w:color="D5E0D9" w:sz="4"/>
-              <w:right w:val="single" w:color="D5E0D9" w:sz="4"/>
-            </w:tcBorders>
-            <w:shd w:fill="EEF6F1" w:color="auto" w:val="clear"/>
-            <w:tcMar>
-              <w:top w:type="dxa" w:w="60"/>
-              <w:left w:type="dxa" w:w="100"/>
-              <w:bottom w:type="dxa" w:w="60"/>
-              <w:right w:type="dxa" w:w="100"/>
-            </w:tcMar>
-          </w:tcPr>
-          <w:p>
-            <w:r>
-              <w:rPr>
-                <w:rFonts w:ascii="Arial" w:cs="Arial" w:eastAsia="Arial" w:hAnsi="Arial"/>
-                <w:b/>
-                <w:bCs/>
-                <w:color w:val="1E4F38"/>
-                <w:sz w:val="20"/>
-                <w:szCs w:val="20"/>
-              </w:rPr>
-              <w:t xml:space="preserve">C. Thử nghiệm</w:t>
-            </w:r>
-          </w:p>
-        </w:tc>
-      </w:tr>
-      <w:tr>
-        <w:trPr>
-          <w:cantSplit/>
-        </w:trPr>
-        <w:tc>
-          <w:tcPr>
             <w:tcW w:type="dxa" w:w="520"/>
             <w:tcBorders>
               <w:top w:val="single" w:color="D5E0D9" w:sz="4"/>
@@ -4347,446 +4995,7 @@
                 <w:sz w:val="19"/>
                 <w:szCs w:val="19"/>
               </w:rPr>
-              <w:t xml:space="preserve">11</w:t>
-            </w:r>
-          </w:p>
-        </w:tc>
-        <w:tc>
-          <w:tcPr>
-            <w:tcW w:type="dxa" w:w="3500"/>
-            <w:tcBorders>
-              <w:top w:val="single" w:color="D5E0D9" w:sz="4"/>
-              <w:left w:val="single" w:color="D5E0D9" w:sz="4"/>
-              <w:bottom w:val="single" w:color="D5E0D9" w:sz="4"/>
-              <w:right w:val="single" w:color="D5E0D9" w:sz="4"/>
-            </w:tcBorders>
-            <w:tcMar>
-              <w:top w:type="dxa" w:w="70"/>
-              <w:left w:type="dxa" w:w="100"/>
-              <w:bottom w:type="dxa" w:w="70"/>
-              <w:right w:type="dxa" w:w="100"/>
-            </w:tcMar>
-            <w:vAlign w:val="center"/>
-          </w:tcPr>
-          <w:p>
-            <w:pPr>
-              <w:spacing w:after="20" w:line="270"/>
-            </w:pPr>
-            <w:r>
-              <w:rPr>
-                <w:rFonts w:ascii="Arial" w:cs="Arial" w:eastAsia="Arial" w:hAnsi="Arial"/>
-                <w:b/>
-                <w:bCs/>
-                <w:sz w:val="19"/>
-                <w:szCs w:val="19"/>
-              </w:rPr>
-              <w:t xml:space="preserve">Danh sách tối thiểu 12 địa chỉ Gmail người thử</w:t>
-            </w:r>
-          </w:p>
-        </w:tc>
-        <w:tc>
-          <w:tcPr>
-            <w:tcW w:type="dxa" w:w="3318"/>
-            <w:tcBorders>
-              <w:top w:val="single" w:color="D5E0D9" w:sz="4"/>
-              <w:left w:val="single" w:color="D5E0D9" w:sz="4"/>
-              <w:bottom w:val="single" w:color="D5E0D9" w:sz="4"/>
-              <w:right w:val="single" w:color="D5E0D9" w:sz="4"/>
-            </w:tcBorders>
-            <w:tcMar>
-              <w:top w:type="dxa" w:w="70"/>
-              <w:left w:type="dxa" w:w="100"/>
-              <w:bottom w:type="dxa" w:w="70"/>
-              <w:right w:type="dxa" w:w="100"/>
-            </w:tcMar>
-            <w:vAlign w:val="center"/>
-          </w:tcPr>
-          <w:p>
-            <w:pPr>
-              <w:spacing w:after="20" w:line="270"/>
-            </w:pPr>
-            <w:r>
-              <w:rPr>
-                <w:rFonts w:ascii="Arial" w:cs="Arial" w:eastAsia="Arial" w:hAnsi="Arial"/>
-                <w:color w:val="5F6B63"/>
-                <w:sz w:val="19"/>
-                <w:szCs w:val="19"/>
-              </w:rPr>
-              <w:t xml:space="preserve">Google bắt buộc thử nghiệm kín 14 ngày (tài khoản cá nhân)</w:t>
-            </w:r>
-          </w:p>
-        </w:tc>
-        <w:tc>
-          <w:tcPr>
-            <w:tcW w:type="dxa" w:w="2300"/>
-            <w:tcBorders>
-              <w:top w:val="single" w:color="D5E0D9" w:sz="4"/>
-              <w:left w:val="single" w:color="D5E0D9" w:sz="4"/>
-              <w:bottom w:val="single" w:color="D5E0D9" w:sz="4"/>
-              <w:right w:val="single" w:color="D5E0D9" w:sz="4"/>
-            </w:tcBorders>
-            <w:tcMar>
-              <w:top w:type="dxa" w:w="70"/>
-              <w:left w:type="dxa" w:w="100"/>
-              <w:bottom w:type="dxa" w:w="70"/>
-              <w:right w:type="dxa" w:w="100"/>
-            </w:tcMar>
-            <w:vAlign w:val="center"/>
-          </w:tcPr>
-          <w:p>
-            <w:pPr>
-              <w:spacing w:after="20" w:line="270"/>
-            </w:pPr>
-            <w:r>
-              <w:rPr>
-                <w:rFonts w:ascii="Arial" w:cs="Arial" w:eastAsia="Arial" w:hAnsi="Arial"/>
-                <w:sz w:val="19"/>
-                <w:szCs w:val="19"/>
-              </w:rPr>
-              <w:t xml:space="preserve"/>
-            </w:r>
-          </w:p>
-        </w:tc>
-      </w:tr>
-      <w:tr>
-        <w:trPr>
-          <w:cantSplit/>
-        </w:trPr>
-        <w:tc>
-          <w:tcPr>
-            <w:tcW w:type="dxa" w:w="520"/>
-            <w:tcBorders>
-              <w:top w:val="single" w:color="D5E0D9" w:sz="4"/>
-              <w:left w:val="single" w:color="D5E0D9" w:sz="4"/>
-              <w:bottom w:val="single" w:color="D5E0D9" w:sz="4"/>
-              <w:right w:val="single" w:color="D5E0D9" w:sz="4"/>
-            </w:tcBorders>
-            <w:tcMar>
-              <w:top w:type="dxa" w:w="70"/>
-              <w:left w:type="dxa" w:w="100"/>
-              <w:bottom w:type="dxa" w:w="70"/>
-              <w:right w:type="dxa" w:w="100"/>
-            </w:tcMar>
-            <w:vAlign w:val="center"/>
-          </w:tcPr>
-          <w:p>
-            <w:pPr>
-              <w:spacing w:after="20" w:line="270"/>
-              <w:jc w:val="center"/>
-            </w:pPr>
-            <w:r>
-              <w:rPr>
-                <w:rFonts w:ascii="Arial" w:cs="Arial" w:eastAsia="Arial" w:hAnsi="Arial"/>
-                <w:color w:val="5F6B63"/>
-                <w:sz w:val="19"/>
-                <w:szCs w:val="19"/>
-              </w:rPr>
-              <w:t xml:space="preserve">12</w:t>
-            </w:r>
-          </w:p>
-        </w:tc>
-        <w:tc>
-          <w:tcPr>
-            <w:tcW w:type="dxa" w:w="3500"/>
-            <w:tcBorders>
-              <w:top w:val="single" w:color="D5E0D9" w:sz="4"/>
-              <w:left w:val="single" w:color="D5E0D9" w:sz="4"/>
-              <w:bottom w:val="single" w:color="D5E0D9" w:sz="4"/>
-              <w:right w:val="single" w:color="D5E0D9" w:sz="4"/>
-            </w:tcBorders>
-            <w:tcMar>
-              <w:top w:type="dxa" w:w="70"/>
-              <w:left w:type="dxa" w:w="100"/>
-              <w:bottom w:type="dxa" w:w="70"/>
-              <w:right w:type="dxa" w:w="100"/>
-            </w:tcMar>
-            <w:vAlign w:val="center"/>
-          </w:tcPr>
-          <w:p>
-            <w:pPr>
-              <w:spacing w:after="20" w:line="270"/>
-            </w:pPr>
-            <w:r>
-              <w:rPr>
-                <w:rFonts w:ascii="Arial" w:cs="Arial" w:eastAsia="Arial" w:hAnsi="Arial"/>
-                <w:b/>
-                <w:bCs/>
-                <w:sz w:val="19"/>
-                <w:szCs w:val="19"/>
-              </w:rPr>
-              <w:t xml:space="preserve">Email Apple ID người thử iPhone (tùy chọn)</w:t>
-            </w:r>
-          </w:p>
-        </w:tc>
-        <w:tc>
-          <w:tcPr>
-            <w:tcW w:type="dxa" w:w="3318"/>
-            <w:tcBorders>
-              <w:top w:val="single" w:color="D5E0D9" w:sz="4"/>
-              <w:left w:val="single" w:color="D5E0D9" w:sz="4"/>
-              <w:bottom w:val="single" w:color="D5E0D9" w:sz="4"/>
-              <w:right w:val="single" w:color="D5E0D9" w:sz="4"/>
-            </w:tcBorders>
-            <w:tcMar>
-              <w:top w:type="dxa" w:w="70"/>
-              <w:left w:type="dxa" w:w="100"/>
-              <w:bottom w:type="dxa" w:w="70"/>
-              <w:right w:type="dxa" w:w="100"/>
-            </w:tcMar>
-            <w:vAlign w:val="center"/>
-          </w:tcPr>
-          <w:p>
-            <w:pPr>
-              <w:spacing w:after="20" w:line="270"/>
-            </w:pPr>
-            <w:r>
-              <w:rPr>
-                <w:rFonts w:ascii="Arial" w:cs="Arial" w:eastAsia="Arial" w:hAnsi="Arial"/>
-                <w:color w:val="5F6B63"/>
-                <w:sz w:val="19"/>
-                <w:szCs w:val="19"/>
-              </w:rPr>
-              <w:t xml:space="preserve">Cài bản thử qua TestFlight</w:t>
-            </w:r>
-          </w:p>
-        </w:tc>
-        <w:tc>
-          <w:tcPr>
-            <w:tcW w:type="dxa" w:w="2300"/>
-            <w:tcBorders>
-              <w:top w:val="single" w:color="D5E0D9" w:sz="4"/>
-              <w:left w:val="single" w:color="D5E0D9" w:sz="4"/>
-              <w:bottom w:val="single" w:color="D5E0D9" w:sz="4"/>
-              <w:right w:val="single" w:color="D5E0D9" w:sz="4"/>
-            </w:tcBorders>
-            <w:tcMar>
-              <w:top w:type="dxa" w:w="70"/>
-              <w:left w:type="dxa" w:w="100"/>
-              <w:bottom w:type="dxa" w:w="70"/>
-              <w:right w:type="dxa" w:w="100"/>
-            </w:tcMar>
-            <w:vAlign w:val="center"/>
-          </w:tcPr>
-          <w:p>
-            <w:pPr>
-              <w:spacing w:after="20" w:line="270"/>
-            </w:pPr>
-            <w:r>
-              <w:rPr>
-                <w:rFonts w:ascii="Arial" w:cs="Arial" w:eastAsia="Arial" w:hAnsi="Arial"/>
-                <w:sz w:val="19"/>
-                <w:szCs w:val="19"/>
-              </w:rPr>
-              <w:t xml:space="preserve"/>
-            </w:r>
-          </w:p>
-        </w:tc>
-      </w:tr>
-      <w:tr>
-        <w:trPr>
-          <w:cantSplit/>
-        </w:trPr>
-        <w:tc>
-          <w:tcPr>
-            <w:tcW w:type="dxa" w:w="9638"/>
-            <w:gridSpan w:val="4"/>
-            <w:tcBorders>
-              <w:top w:val="single" w:color="D5E0D9" w:sz="4"/>
-              <w:left w:val="single" w:color="D5E0D9" w:sz="4"/>
-              <w:bottom w:val="single" w:color="D5E0D9" w:sz="4"/>
-              <w:right w:val="single" w:color="D5E0D9" w:sz="4"/>
-            </w:tcBorders>
-            <w:shd w:fill="EEF6F1" w:color="auto" w:val="clear"/>
-            <w:tcMar>
-              <w:top w:type="dxa" w:w="60"/>
-              <w:left w:type="dxa" w:w="100"/>
-              <w:bottom w:type="dxa" w:w="60"/>
-              <w:right w:type="dxa" w:w="100"/>
-            </w:tcMar>
-          </w:tcPr>
-          <w:p>
-            <w:r>
-              <w:rPr>
-                <w:rFonts w:ascii="Arial" w:cs="Arial" w:eastAsia="Arial" w:hAnsi="Arial"/>
-                <w:b/>
-                <w:bCs/>
-                <w:color w:val="1E4F38"/>
-                <w:sz w:val="20"/>
-                <w:szCs w:val="20"/>
-              </w:rPr>
-              <w:t xml:space="preserve">D. Nội dung</w:t>
-            </w:r>
-          </w:p>
-        </w:tc>
-      </w:tr>
-      <w:tr>
-        <w:trPr>
-          <w:cantSplit/>
-        </w:trPr>
-        <w:tc>
-          <w:tcPr>
-            <w:tcW w:type="dxa" w:w="520"/>
-            <w:tcBorders>
-              <w:top w:val="single" w:color="D5E0D9" w:sz="4"/>
-              <w:left w:val="single" w:color="D5E0D9" w:sz="4"/>
-              <w:bottom w:val="single" w:color="D5E0D9" w:sz="4"/>
-              <w:right w:val="single" w:color="D5E0D9" w:sz="4"/>
-            </w:tcBorders>
-            <w:tcMar>
-              <w:top w:type="dxa" w:w="70"/>
-              <w:left w:type="dxa" w:w="100"/>
-              <w:bottom w:type="dxa" w:w="70"/>
-              <w:right w:type="dxa" w:w="100"/>
-            </w:tcMar>
-            <w:vAlign w:val="center"/>
-          </w:tcPr>
-          <w:p>
-            <w:pPr>
-              <w:spacing w:after="20" w:line="270"/>
-              <w:jc w:val="center"/>
-            </w:pPr>
-            <w:r>
-              <w:rPr>
-                <w:rFonts w:ascii="Arial" w:cs="Arial" w:eastAsia="Arial" w:hAnsi="Arial"/>
-                <w:color w:val="5F6B63"/>
-                <w:sz w:val="19"/>
-                <w:szCs w:val="19"/>
-              </w:rPr>
               <w:t xml:space="preserve">13</w:t>
-            </w:r>
-          </w:p>
-        </w:tc>
-        <w:tc>
-          <w:tcPr>
-            <w:tcW w:type="dxa" w:w="3500"/>
-            <w:tcBorders>
-              <w:top w:val="single" w:color="D5E0D9" w:sz="4"/>
-              <w:left w:val="single" w:color="D5E0D9" w:sz="4"/>
-              <w:bottom w:val="single" w:color="D5E0D9" w:sz="4"/>
-              <w:right w:val="single" w:color="D5E0D9" w:sz="4"/>
-            </w:tcBorders>
-            <w:tcMar>
-              <w:top w:type="dxa" w:w="70"/>
-              <w:left w:type="dxa" w:w="100"/>
-              <w:bottom w:type="dxa" w:w="70"/>
-              <w:right w:type="dxa" w:w="100"/>
-            </w:tcMar>
-            <w:vAlign w:val="center"/>
-          </w:tcPr>
-          <w:p>
-            <w:pPr>
-              <w:spacing w:after="20" w:line="270"/>
-            </w:pPr>
-            <w:r>
-              <w:rPr>
-                <w:rFonts w:ascii="Arial" w:cs="Arial" w:eastAsia="Arial" w:hAnsi="Arial"/>
-                <w:b/>
-                <w:bCs/>
-                <w:sz w:val="19"/>
-                <w:szCs w:val="19"/>
-              </w:rPr>
-              <w:t xml:space="preserve">Phác đồ muốn bổ sung thêm (ảnh chụp trang sách, ghi số trang) – tùy chọn</w:t>
-            </w:r>
-          </w:p>
-        </w:tc>
-        <w:tc>
-          <w:tcPr>
-            <w:tcW w:type="dxa" w:w="3318"/>
-            <w:tcBorders>
-              <w:top w:val="single" w:color="D5E0D9" w:sz="4"/>
-              <w:left w:val="single" w:color="D5E0D9" w:sz="4"/>
-              <w:bottom w:val="single" w:color="D5E0D9" w:sz="4"/>
-              <w:right w:val="single" w:color="D5E0D9" w:sz="4"/>
-            </w:tcBorders>
-            <w:tcMar>
-              <w:top w:type="dxa" w:w="70"/>
-              <w:left w:type="dxa" w:w="100"/>
-              <w:bottom w:type="dxa" w:w="70"/>
-              <w:right w:type="dxa" w:w="100"/>
-            </w:tcMar>
-            <w:vAlign w:val="center"/>
-          </w:tcPr>
-          <w:p>
-            <w:pPr>
-              <w:spacing w:after="20" w:line="270"/>
-            </w:pPr>
-            <w:r>
-              <w:rPr>
-                <w:rFonts w:ascii="Arial" w:cs="Arial" w:eastAsia="Arial" w:hAnsi="Arial"/>
-                <w:color w:val="5F6B63"/>
-                <w:sz w:val="19"/>
-                <w:szCs w:val="19"/>
-              </w:rPr>
-              <w:t xml:space="preserve">Mở rộng thư viện phác đồ trong ứng dụng</w:t>
-            </w:r>
-          </w:p>
-        </w:tc>
-        <w:tc>
-          <w:tcPr>
-            <w:tcW w:type="dxa" w:w="2300"/>
-            <w:tcBorders>
-              <w:top w:val="single" w:color="D5E0D9" w:sz="4"/>
-              <w:left w:val="single" w:color="D5E0D9" w:sz="4"/>
-              <w:bottom w:val="single" w:color="D5E0D9" w:sz="4"/>
-              <w:right w:val="single" w:color="D5E0D9" w:sz="4"/>
-            </w:tcBorders>
-            <w:tcMar>
-              <w:top w:type="dxa" w:w="70"/>
-              <w:left w:type="dxa" w:w="100"/>
-              <w:bottom w:type="dxa" w:w="70"/>
-              <w:right w:type="dxa" w:w="100"/>
-            </w:tcMar>
-            <w:vAlign w:val="center"/>
-          </w:tcPr>
-          <w:p>
-            <w:pPr>
-              <w:spacing w:after="20" w:line="270"/>
-            </w:pPr>
-            <w:r>
-              <w:rPr>
-                <w:rFonts w:ascii="Arial" w:cs="Arial" w:eastAsia="Arial" w:hAnsi="Arial"/>
-                <w:sz w:val="19"/>
-                <w:szCs w:val="19"/>
-              </w:rPr>
-              <w:t xml:space="preserve"/>
-            </w:r>
-          </w:p>
-        </w:tc>
-      </w:tr>
-      <w:tr>
-        <w:trPr>
-          <w:cantSplit/>
-        </w:trPr>
-        <w:tc>
-          <w:tcPr>
-            <w:tcW w:type="dxa" w:w="520"/>
-            <w:tcBorders>
-              <w:top w:val="single" w:color="D5E0D9" w:sz="4"/>
-              <w:left w:val="single" w:color="D5E0D9" w:sz="4"/>
-              <w:bottom w:val="single" w:color="D5E0D9" w:sz="4"/>
-              <w:right w:val="single" w:color="D5E0D9" w:sz="4"/>
-            </w:tcBorders>
-            <w:tcMar>
-              <w:top w:type="dxa" w:w="70"/>
-              <w:left w:type="dxa" w:w="100"/>
-              <w:bottom w:type="dxa" w:w="70"/>
-              <w:right w:type="dxa" w:w="100"/>
-            </w:tcMar>
-            <w:vAlign w:val="center"/>
-          </w:tcPr>
-          <w:p>
-            <w:pPr>
-              <w:spacing w:after="20" w:line="270"/>
-              <w:jc w:val="center"/>
-            </w:pPr>
-            <w:r>
-              <w:rPr>
-                <w:rFonts w:ascii="Arial" w:cs="Arial" w:eastAsia="Arial" w:hAnsi="Arial"/>
-                <w:color w:val="5F6B63"/>
-                <w:sz w:val="19"/>
-                <w:szCs w:val="19"/>
-              </w:rPr>
-              <w:t xml:space="preserve">14</w:t>
             </w:r>
           </w:p>
         </w:tc>
@@ -6081,7 +6290,7 @@
                 <w:sz w:val="18"/>
                 <w:szCs w:val="18"/>
               </w:rPr>
-              <w:t xml:space="preserve">Thầy cung cấp thông tin mục 3</w:t>
+              <w:t xml:space="preserve">Máy chủ Railway + email Resend (đã xong)</w:t>
             </w:r>
           </w:p>
           <w:p>
@@ -6092,7 +6301,7 @@
                 <w:sz w:val="16"/>
                 <w:szCs w:val="16"/>
               </w:rPr>
-              <w:t xml:space="preserve">Khách hàng</w:t>
+              <w:t xml:space="preserve">Đội phát triển</w:t>
             </w:r>
           </w:p>
         </w:tc>
@@ -6123,7 +6332,7 @@
                 <w:sz w:val="18"/>
                 <w:szCs w:val="18"/>
               </w:rPr>
-              <w:t xml:space="preserve">15–20/10</w:t>
+              <w:t xml:space="preserve">15–16/10</w:t>
             </w:r>
           </w:p>
         </w:tc>
@@ -6136,7 +6345,7 @@
               <w:bottom w:val="single" w:color="D5E0D9" w:sz="4"/>
               <w:right w:val="single" w:color="D5E0D9" w:sz="4"/>
             </w:tcBorders>
-            <w:shd w:fill="B55238" w:color="auto" w:val="clear"/>
+            <w:shd w:fill="1E4F38" w:color="auto" w:val="clear"/>
             <w:tcMar>
               <w:top w:type="dxa" w:w="70"/>
               <w:left w:type="dxa" w:w="100"/>
@@ -6168,7 +6377,6 @@
               <w:bottom w:val="single" w:color="D5E0D9" w:sz="4"/>
               <w:right w:val="single" w:color="D5E0D9" w:sz="4"/>
             </w:tcBorders>
-            <w:shd w:fill="B55238" w:color="auto" w:val="clear"/>
             <w:tcMar>
               <w:top w:type="dxa" w:w="70"/>
               <w:left w:type="dxa" w:w="100"/>
@@ -6349,7 +6557,7 @@
                 <w:sz w:val="18"/>
                 <w:szCs w:val="18"/>
               </w:rPr>
-              <w:t xml:space="preserve">Đăng ký &amp; xác minh tài khoản Apple, Google</w:t>
+              <w:t xml:space="preserve">Thầy cung cấp thông tin mục 3 / chọn Cá nhân–Tổ chức</w:t>
             </w:r>
           </w:p>
           <w:p>
@@ -6360,7 +6568,7 @@
                 <w:sz w:val="16"/>
                 <w:szCs w:val="16"/>
               </w:rPr>
-              <w:t xml:space="preserve">Khách hàng + Apple/Google</w:t>
+              <w:t xml:space="preserve">Khách hàng</w:t>
             </w:r>
           </w:p>
         </w:tc>
@@ -6391,7 +6599,7 @@
                 <w:sz w:val="18"/>
                 <w:szCs w:val="18"/>
               </w:rPr>
-              <w:t xml:space="preserve">19–23/10</w:t>
+              <w:t xml:space="preserve">16–22/10</w:t>
             </w:r>
           </w:p>
         </w:tc>
@@ -6404,6 +6612,7 @@
               <w:bottom w:val="single" w:color="D5E0D9" w:sz="4"/>
               <w:right w:val="single" w:color="D5E0D9" w:sz="4"/>
             </w:tcBorders>
+            <w:shd w:fill="B55238" w:color="auto" w:val="clear"/>
             <w:tcMar>
               <w:top w:type="dxa" w:w="70"/>
               <w:left w:type="dxa" w:w="100"/>
@@ -6616,7 +6825,7 @@
                 <w:sz w:val="18"/>
                 <w:szCs w:val="18"/>
               </w:rPr>
-              <w:t xml:space="preserve">Triển khai máy chủ, email; build bản kết nối máy chủ thật</w:t>
+              <w:t xml:space="preserve">Đăng ký &amp; xác minh tài khoản Apple, Google</w:t>
             </w:r>
           </w:p>
           <w:p>
@@ -6627,7 +6836,7 @@
                 <w:sz w:val="16"/>
                 <w:szCs w:val="16"/>
               </w:rPr>
-              <w:t xml:space="preserve">Đội phát triển</w:t>
+              <w:t xml:space="preserve">Khách hàng + Apple/Google</w:t>
             </w:r>
           </w:p>
         </w:tc>
@@ -6658,7 +6867,7 @@
                 <w:sz w:val="18"/>
                 <w:szCs w:val="18"/>
               </w:rPr>
-              <w:t xml:space="preserve">21–24/10</w:t>
+              <w:t xml:space="preserve">20–27/10</w:t>
             </w:r>
           </w:p>
         </w:tc>
@@ -6702,7 +6911,7 @@
               <w:bottom w:val="single" w:color="D5E0D9" w:sz="4"/>
               <w:right w:val="single" w:color="D5E0D9" w:sz="4"/>
             </w:tcBorders>
-            <w:shd w:fill="1E4F38" w:color="auto" w:val="clear"/>
+            <w:shd w:fill="B55238" w:color="auto" w:val="clear"/>
             <w:tcMar>
               <w:top w:type="dxa" w:w="70"/>
               <w:left w:type="dxa" w:w="100"/>
@@ -6883,7 +7092,7 @@
                 <w:sz w:val="18"/>
                 <w:szCs w:val="18"/>
               </w:rPr>
-              <w:t xml:space="preserve">Hoàn thiện hạng mục còn lại, bổ sung phác đồ, sửa lỗi</w:t>
+              <w:t xml:space="preserve">Hoàn thiện hạng mục còn lại, đối chiếu huyệt, sửa lỗi</w:t>
             </w:r>
           </w:p>
           <w:p>
@@ -6925,7 +7134,7 @@
                 <w:sz w:val="18"/>
                 <w:szCs w:val="18"/>
               </w:rPr>
-              <w:t xml:space="preserve">19/10–06/11</w:t>
+              <w:t xml:space="preserve">16/10–06/11</w:t>
             </w:r>
           </w:p>
         </w:tc>
@@ -6938,6 +7147,7 @@
               <w:bottom w:val="single" w:color="D5E0D9" w:sz="4"/>
               <w:right w:val="single" w:color="D5E0D9" w:sz="4"/>
             </w:tcBorders>
+            <w:shd w:fill="1E4F38" w:color="auto" w:val="clear"/>
             <w:tcMar>
               <w:top w:type="dxa" w:w="70"/>
               <w:left w:type="dxa" w:w="100"/>
@@ -7194,7 +7404,7 @@
                 <w:sz w:val="18"/>
                 <w:szCs w:val="18"/>
               </w:rPr>
-              <w:t xml:space="preserve">26/10–09/11</w:t>
+              <w:t xml:space="preserve">27/10–10/11</w:t>
             </w:r>
           </w:p>
         </w:tc>
@@ -7463,7 +7673,7 @@
                 <w:sz w:val="18"/>
                 <w:szCs w:val="18"/>
               </w:rPr>
-              <w:t xml:space="preserve">02–06/11</w:t>
+              <w:t xml:space="preserve">03–07/11</w:t>
             </w:r>
           </w:p>
         </w:tc>
@@ -7730,7 +7940,7 @@
                 <w:sz w:val="18"/>
                 <w:szCs w:val="18"/>
               </w:rPr>
-              <w:t xml:space="preserve">06–11/11</w:t>
+              <w:t xml:space="preserve">07–12/11</w:t>
             </w:r>
           </w:p>
         </w:tc>
@@ -7998,7 +8208,7 @@
                 <w:sz w:val="18"/>
                 <w:szCs w:val="18"/>
               </w:rPr>
-              <w:t xml:space="preserve">10–17/11</w:t>
+              <w:t xml:space="preserve">11–18/11</w:t>
             </w:r>
           </w:p>
         </w:tc>
@@ -8266,7 +8476,7 @@
                 <w:sz w:val="18"/>
                 <w:szCs w:val="18"/>
               </w:rPr>
-              <w:t xml:space="preserve">16–20/11</w:t>
+              <w:t xml:space="preserve">17–21/11</w:t>
             </w:r>
           </w:p>
         </w:tc>
@@ -8481,7 +8691,7 @@
           <w:sz w:val="21"/>
           <w:szCs w:val="21"/>
         </w:rPr>
-        <w:t xml:space="preserve">Mốc phụ thuộc: </w:t>
+        <w:t xml:space="preserve">Đã hoàn thành sớm: </w:t>
       </w:r>
       <w:r>
         <w:rPr>
@@ -8489,7 +8699,35 @@
           <w:sz w:val="21"/>
           <w:szCs w:val="21"/>
         </w:rPr>
-        <w:t xml:space="preserve">lịch tính từ khi nhận đủ thông tin mục 3 trước 20/10/2026; mỗi ngày chậm sẽ lùi tương ứng.</w:t>
+        <w:t xml:space="preserve">máy chủ và email (tuần 12–16/10), không còn chờ mục này để chạy app thật.</w:t>
+      </w:r>
+    </w:p>
+    <w:p>
+      <w:pPr>
+        <w:pStyle w:val="ListParagraph"/>
+        <w:numPr>
+          <w:ilvl w:val="0"/>
+          <w:numId w:val="2"/>
+        </w:numPr>
+        <w:spacing w:after="60" w:line="290"/>
+      </w:pPr>
+      <w:r>
+        <w:rPr>
+          <w:rFonts w:ascii="Arial" w:cs="Arial" w:eastAsia="Arial" w:hAnsi="Arial"/>
+          <w:b/>
+          <w:bCs/>
+          <w:sz w:val="21"/>
+          <w:szCs w:val="21"/>
+        </w:rPr>
+        <w:t xml:space="preserve">Mốc phụ thuộc còn lại: </w:t>
+      </w:r>
+      <w:r>
+        <w:rPr>
+          <w:rFonts w:ascii="Arial" w:cs="Arial" w:eastAsia="Arial" w:hAnsi="Arial"/>
+          <w:sz w:val="21"/>
+          <w:szCs w:val="21"/>
+        </w:rPr>
+        <w:t xml:space="preserve">thông tin mục 3 và tài khoản Apple/Google; mỗi ngày chậm sẽ lùi lịch nộp store.</w:t>
       </w:r>
     </w:p>
     <w:p>
@@ -8537,7 +8775,7 @@
           <w:sz w:val="21"/>
           <w:szCs w:val="21"/>
         </w:rPr>
-        <w:t xml:space="preserve">Nội dung sức khỏe: </w:t>
+        <w:t xml:space="preserve">Email production: </w:t>
       </w:r>
       <w:r>
         <w:rPr>
@@ -8545,7 +8783,7 @@
           <w:sz w:val="21"/>
           <w:szCs w:val="21"/>
         </w:rPr>
-        <w:t xml:space="preserve">store có thể từ chối nếu thông tin chưa chính xác, nên các phác đồ bổ sung cần được Thầy duyệt trước UAT.</w:t>
+        <w:t xml:space="preserve">nên gắn tên miền riêng vào Resend để gửi mã quên mật khẩu tới mọi người dùng (hiện domain thử Resend giới hạn người nhận).</w:t>
       </w:r>
     </w:p>
     <w:p>
@@ -8631,7 +8869,25 @@
           <w:sz w:val="21"/>
           <w:szCs w:val="21"/>
         </w:rPr>
-        <w:t xml:space="preserve">Đội phát triển triển khai máy chủ thật, phát hành bản thử và gửi hướng dẫn cài đặt cho người thử.</w:t>
+        <w:t xml:space="preserve">Đội phát triển phát hành bản thử (TestFlight / thử nghiệm kín), cùng Thầy UAT, rồi nộp store.</w:t>
+      </w:r>
+    </w:p>
+    <w:p>
+      <w:pPr>
+        <w:pStyle w:val="ListParagraph"/>
+        <w:numPr>
+          <w:ilvl w:val="0"/>
+          <w:numId w:val="2"/>
+        </w:numPr>
+        <w:spacing w:after="60" w:line="290"/>
+      </w:pPr>
+      <w:r>
+        <w:rPr>
+          <w:rFonts w:ascii="Arial" w:cs="Arial" w:eastAsia="Arial" w:hAnsi="Arial"/>
+          <w:sz w:val="21"/>
+          <w:szCs w:val="21"/>
+        </w:rPr>
+        <w:t xml:space="preserve">Song song: đối chiếu thêm vị trí huyệt theo sơ đồ Thầy gửi; gắn tên miền gửi mail nếu Thầy cung cấp.</w:t>
       </w:r>
     </w:p>
     <w:p>

</xml_diff>